<commit_message>
docs(PRD): 升到 v1.1，补充阴阳历日历章节（FR-117 / FR-204~206）
- 产品形态改为 Web/PWA 为主，小程序停止迭代；模块 15 → 16
- 新增历法层（范围总览）与 M5 阴阳历日历里程碑，原 M5 顺延为 M6
- 功能需求新增 FR-117 日历（阴阳历）、FR-204 农历换算、FR-205 二十四节气、FR-206 节日与节气展示规则
- 技术约束补充节气天文算法与农历日查表两条踩坑
- 验收标准更新为 31 脚本 / 470+ 断言，真机清单加日历页与安装到主屏幕
- 术语表补充农历、节气、干支
</commit_message>
<xml_diff>
--- a/output/38c7bdd2-9d0c-45fe-8a46-6ebe081353f3/stage3/小宝工作台产品需求文档PRD.docx
+++ b/output/38c7bdd2-9d0c-45fe-8a46-6ebe081353f3/stage3/小宝工作台产品需求文档PRD.docx
@@ -298,7 +298,7 @@
                 <w:color w:val="1f2328"/>
                 <w:sz w:val="21"/>
               </w:rPr>
-              <w:t>v1.0</w:t>
+              <w:t>v1.1</w:t>
             </w:r>
           </w:p>
         </w:tc>
@@ -440,7 +440,16 @@
                 <w:color w:val="1f2328"/>
                 <w:sz w:val="21"/>
               </w:rPr>
-              <w:t>微信小程序 v1.5.0 ｜ Web / PWA v1.6.0</w:t>
+              <w:t xml:space="preserve">微信小程序 v1.5.0（已停止迭代）｜ Web / PWA </w:t>
+            </w:r>
+            <w:r>
+              <w:rPr>
+                <w:rFonts w:ascii="SimSun" w:hAnsi="SimSun" w:eastAsia="SimSun" w:cs="SimSun"/>
+                <w:b w:val="1"/>
+                <w:color w:val="1f2328"/>
+                <w:sz w:val="21"/>
+              </w:rPr>
+              <w:t>v1.7.0</w:t>
             </w:r>
           </w:p>
         </w:tc>
@@ -511,7 +520,7 @@
                 <w:color w:val="1f2328"/>
                 <w:sz w:val="21"/>
               </w:rPr>
-              <w:t>微信小程序 + 单文件 Web 应用（可安装为 PWA）</w:t>
+              <w:t>以单文件 Web 应用（可安装为 PWA）为主，手机与电脑浏览器均可用；小程序源码保留但不再迭代</w:t>
             </w:r>
           </w:p>
         </w:tc>
@@ -986,6 +995,145 @@
                 <w:sz w:val="21"/>
               </w:rPr>
               <w:t>首次成文，覆盖 M1 至 M4 已交付能力及 M5 规划</w:t>
+            </w:r>
+          </w:p>
+        </w:tc>
+      </w:tr>
+      <w:tr>
+        <w:trPr/>
+        <w:tc>
+          <w:tcPr>
+            <w:tcW w:w="2076" w:type="dxa"/>
+            <w:tcBorders>
+              <w:top w:val="single" w:color="c8d3e0" w:sz="6"/>
+              <w:left w:val="single" w:color="c8d3e0" w:sz="6"/>
+              <w:bottom w:val="single" w:color="c8d3e0" w:sz="6"/>
+              <w:right w:val="single" w:color="c8d3e0" w:sz="6"/>
+            </w:tcBorders>
+            <w:shd w:val="clear" w:fill="f5f7fa"/>
+            <w:tcMar>
+              <w:top w:w="90" w:type="dxa"/>
+              <w:left w:w="135" w:type="dxa"/>
+              <w:bottom w:w="90" w:type="dxa"/>
+              <w:right w:w="135" w:type="dxa"/>
+            </w:tcMar>
+            <w:vAlign w:val="top"/>
+          </w:tcPr>
+          <w:p>
+            <w:pPr>
+              <w:rPr>
+                <w:color w:val="1f2328"/>
+              </w:rPr>
+            </w:pPr>
+            <w:r>
+              <w:rPr>
+                <w:rFonts w:ascii="SimSun" w:hAnsi="SimSun" w:eastAsia="SimSun" w:cs="SimSun"/>
+                <w:color w:val="1f2328"/>
+                <w:sz w:val="21"/>
+              </w:rPr>
+              <w:t>v1.1</w:t>
+            </w:r>
+          </w:p>
+        </w:tc>
+        <w:tc>
+          <w:tcPr>
+            <w:tcW w:w="2076" w:type="dxa"/>
+            <w:tcBorders>
+              <w:top w:val="single" w:color="c8d3e0" w:sz="6"/>
+              <w:left w:val="single" w:color="c8d3e0" w:sz="6"/>
+              <w:bottom w:val="single" w:color="c8d3e0" w:sz="6"/>
+              <w:right w:val="single" w:color="c8d3e0" w:sz="6"/>
+            </w:tcBorders>
+            <w:shd w:val="clear" w:fill="f5f7fa"/>
+            <w:tcMar>
+              <w:top w:w="90" w:type="dxa"/>
+              <w:left w:w="135" w:type="dxa"/>
+              <w:bottom w:w="90" w:type="dxa"/>
+              <w:right w:w="135" w:type="dxa"/>
+            </w:tcMar>
+            <w:vAlign w:val="top"/>
+          </w:tcPr>
+          <w:p>
+            <w:pPr>
+              <w:rPr>
+                <w:color w:val="1f2328"/>
+              </w:rPr>
+            </w:pPr>
+            <w:r>
+              <w:rPr>
+                <w:rFonts w:ascii="SimSun" w:hAnsi="SimSun" w:eastAsia="SimSun" w:cs="SimSun"/>
+                <w:color w:val="1f2328"/>
+                <w:sz w:val="21"/>
+              </w:rPr>
+              <w:t>2026-10-21</w:t>
+            </w:r>
+          </w:p>
+        </w:tc>
+        <w:tc>
+          <w:tcPr>
+            <w:tcW w:w="2076" w:type="dxa"/>
+            <w:tcBorders>
+              <w:top w:val="single" w:color="c8d3e0" w:sz="6"/>
+              <w:left w:val="single" w:color="c8d3e0" w:sz="6"/>
+              <w:bottom w:val="single" w:color="c8d3e0" w:sz="6"/>
+              <w:right w:val="single" w:color="c8d3e0" w:sz="6"/>
+            </w:tcBorders>
+            <w:shd w:val="clear" w:fill="f5f7fa"/>
+            <w:tcMar>
+              <w:top w:w="90" w:type="dxa"/>
+              <w:left w:w="135" w:type="dxa"/>
+              <w:bottom w:w="90" w:type="dxa"/>
+              <w:right w:w="135" w:type="dxa"/>
+            </w:tcMar>
+            <w:vAlign w:val="top"/>
+          </w:tcPr>
+          <w:p>
+            <w:pPr>
+              <w:rPr>
+                <w:color w:val="1f2328"/>
+              </w:rPr>
+            </w:pPr>
+            <w:r>
+              <w:rPr>
+                <w:rFonts w:hint="eastAsia" w:ascii="SimSun" w:hAnsi="SimSun" w:eastAsia="SimSun" w:cs="SimSun"/>
+                <w:color w:val="1f2328"/>
+                <w:sz w:val="21"/>
+              </w:rPr>
+              <w:t>产品负责人</w:t>
+            </w:r>
+          </w:p>
+        </w:tc>
+        <w:tc>
+          <w:tcPr>
+            <w:tcW w:w="2076" w:type="dxa"/>
+            <w:tcBorders>
+              <w:top w:val="single" w:color="c8d3e0" w:sz="6"/>
+              <w:left w:val="single" w:color="c8d3e0" w:sz="6"/>
+              <w:bottom w:val="single" w:color="c8d3e0" w:sz="6"/>
+              <w:right w:val="single" w:color="c8d3e0" w:sz="6"/>
+            </w:tcBorders>
+            <w:shd w:val="clear" w:fill="f5f7fa"/>
+            <w:tcMar>
+              <w:top w:w="90" w:type="dxa"/>
+              <w:left w:w="135" w:type="dxa"/>
+              <w:bottom w:w="90" w:type="dxa"/>
+              <w:right w:w="135" w:type="dxa"/>
+            </w:tcMar>
+            <w:vAlign w:val="top"/>
+          </w:tcPr>
+          <w:p>
+            <w:pPr>
+              <w:rPr>
+                <w:color w:val="1f2328"/>
+              </w:rPr>
+            </w:pPr>
+            <w:r>
+              <w:rPr>
+                <w:rFonts w:hint="eastAsia" w:ascii="SimSun" w:hAnsi="SimSun" w:eastAsia="SimSun" w:cs="SimSun"/>
+                <w:color w:val="1f2328"/>
+                <w:sz w:val="21"/>
+              </w:rPr>
+              <w:t>新增 M5「阴阳历日历」章节与 FR-117、FR-204 至 FR-206；产品形态调整为 Web / PWA 优先，小程序停止迭代；同步验收与风险清单</w:t>
             </w:r>
           </w:p>
         </w:tc>
@@ -2442,7 +2590,24 @@
           <w:color w:val="1f2328"/>
           <w:sz w:val="24"/>
         </w:rPr>
-        <w:t>小宝工作台是一款面向个人用户的「全记录 + 轻回顾」效率工具，以微信小程序与单文件 Web 应用（PWA）双端形态交付。产品将计划、课程、运动、备考、理财、自媒体、阅读、技能、便签、复盘等 15 类日常记录收敛到同一个入口，并通过日历热力图、日历时间轴、自动成长报告与全局搜索，把「记下来」变成「看得见」，最终形成可持续的自我管理闭环。</w:t>
+        <w:t>小宝工作台是一款面向个人用户的「全记录 + 轻回顾」效率工具，</w:t>
+      </w:r>
+      <w:r>
+        <w:rPr>
+          <w:rFonts w:hint="eastAsia" w:ascii="SimSun" w:hAnsi="SimSun" w:eastAsia="SimSun" w:cs="SimSun"/>
+          <w:b w:val="1"/>
+          <w:color w:val="1f2328"/>
+          <w:sz w:val="24"/>
+        </w:rPr>
+        <w:t>自 v1.7.0 起以单文件 Web 应用（PWA）为主要交付形态</w:t>
+      </w:r>
+      <w:r>
+        <w:rPr>
+          <w:rFonts w:hint="eastAsia" w:ascii="SimSun" w:hAnsi="SimSun" w:eastAsia="SimSun" w:cs="SimSun"/>
+          <w:color w:val="1f2328"/>
+          <w:sz w:val="24"/>
+        </w:rPr>
+        <w:t>，手机浏览器与电脑浏览器均可使用，并可添加到主屏幕或桌面、离线运行。产品将计划、课程、运动、备考、理财、自媒体、阅读、技能、便签、复盘、阴阳历日历等 16 类日常记录收敛到同一个入口，并通过日历热力图、日历时间轴、自动成长报告与全局搜索，把「记下来」变成「看得见」，最终形成可持续的自我管理闭环。</w:t>
       </w:r>
     </w:p>
     <w:p>
@@ -2460,7 +2625,7 @@
           <w:color w:val="1f2328"/>
           <w:sz w:val="24"/>
         </w:rPr>
-        <w:t>本文为产品的权威需求说明，包含 5 项产品目标、33 条功能需求（FR-001 至 FR-014、FR-101 至 FR-116、FR-201 至 FR-203）、7 类非功能要求、交互与视觉规范、数据模型、技术架构约束、里程碑状态、验收标准与风险清单。</w:t>
+        <w:t>本文为产品的权威需求说明，包含 5 项产品目标、37 条功能需求（FR-001 至 FR-014、FR-101 至 FR-117、FR-201 至 FR-206）、7 类非功能要求、交互与视觉规范、数据模型、技术架构约束、里程碑状态、验收标准与风险清单。</w:t>
       </w:r>
     </w:p>
     <w:p>
@@ -2487,7 +2652,7 @@
           <w:color w:val="1f2328"/>
           <w:sz w:val="24"/>
         </w:rPr>
-        <w:t>：核心记录层、组织层、回顾层、激励层、智能层、数据层均已交付；提醒层本地能力已交付、微信订阅消息后台推送待配置；小程序与 Web 双端数据互通列为 M5 规划项。</w:t>
+        <w:t>：核心记录层、组织层、回顾层、激励层、智能层、数据层均已交付，M1 至 M5 里程碑全部完成；提醒层本地能力已交付、微信订阅消息后台推送待配置；小程序端自 v1.5.0 起停止迭代；小程序与 Web 双端数据互通列为后续规划项。</w:t>
       </w:r>
     </w:p>
     <w:p>
@@ -4753,6 +4918,65 @@
     </w:p>
     <w:p>
       <w:pPr>
+        <w:numPr>
+          <w:ilvl w:val="0"/>
+          <w:numId w:val="1"/>
+        </w:numPr>
+        <w:pBdr>
+          <w:left w:space="22"/>
+        </w:pBdr>
+        <w:spacing w:before="90" w:after="75" w:line="432"/>
+        <w:ind w:left="90" w:right="90"/>
+        <w:jc w:val="both"/>
+        <w:rPr>
+          <w:color w:val="1f2328"/>
+        </w:rPr>
+      </w:pPr>
+      <w:r>
+        <w:rPr>
+          <w:rFonts w:hint="eastAsia" w:ascii="SimSun" w:hAnsi="SimSun" w:eastAsia="SimSun" w:cs="SimSun"/>
+          <w:b w:val="1"/>
+          <w:color w:val="1f2328"/>
+          <w:sz w:val="24"/>
+        </w:rPr>
+        <w:t>微信小程序端继续迭代</w:t>
+      </w:r>
+      <w:r>
+        <w:rPr>
+          <w:rFonts w:hint="eastAsia" w:ascii="SimSun" w:hAnsi="SimSun" w:eastAsia="SimSun" w:cs="SimSun"/>
+          <w:color w:val="1f2328"/>
+          <w:sz w:val="24"/>
+        </w:rPr>
+        <w:t>（自 v1.7.0 起停止，源码保留便于查阅；新功能只在 Web / PWA 端提供）</w:t>
+      </w:r>
+    </w:p>
+    <w:p>
+      <w:pPr>
+        <w:numPr>
+          <w:ilvl w:val="0"/>
+          <w:numId w:val="1"/>
+        </w:numPr>
+        <w:pBdr>
+          <w:left w:space="22"/>
+        </w:pBdr>
+        <w:spacing w:before="90" w:after="75" w:line="432"/>
+        <w:ind w:left="90" w:right="90"/>
+        <w:jc w:val="both"/>
+        <w:rPr>
+          <w:color w:val="1f2328"/>
+        </w:rPr>
+      </w:pPr>
+      <w:r>
+        <w:rPr>
+          <w:rFonts w:hint="eastAsia" w:ascii="SimSun" w:hAnsi="SimSun" w:eastAsia="SimSun" w:cs="SimSun"/>
+          <w:color w:val="1f2328"/>
+          <w:sz w:val="24"/>
+        </w:rPr>
+        <w:t>黄历宜忌、运势、命理等玄学内容（阴阳历日历只提供历法与节气节日信息）</w:t>
+      </w:r>
+    </w:p>
+    <w:p>
+      <w:pPr>
         <w:pStyle w:val="000006"/>
         <w:keepNext w:val="1"/>
         <w:keepLines w:val="1"/>
@@ -5845,7 +6069,7 @@
                 <w:color w:val="1f2328"/>
                 <w:sz w:val="21"/>
               </w:rPr>
-              <w:t>15 个功能模块（计划、课程、运动、备考、理财、自媒体、阅读、技能、便签、复盘等）</w:t>
+              <w:t>16 个功能模块（计划、课程、运动、备考、理财、自媒体、阅读、技能、便签、复盘、阴阳历日历等）</w:t>
             </w:r>
           </w:p>
         </w:tc>
@@ -6433,7 +6657,7 @@
                 <w:color w:val="1f2328"/>
                 <w:sz w:val="21"/>
               </w:rPr>
-              <w:t>数据层</w:t>
+              <w:t>历法层</w:t>
             </w:r>
           </w:p>
         </w:tc>
@@ -6466,7 +6690,7 @@
                 <w:color w:val="1f2328"/>
                 <w:sz w:val="21"/>
               </w:rPr>
-              <w:t>本地存储、导出与恢复备份、云端同步（可选）</w:t>
+              <w:t>阴阳历日历：农历 1900-2100、二十四节气、传统节日与公历节日</w:t>
             </w:r>
           </w:p>
         </w:tc>
@@ -6536,6 +6760,110 @@
                 <w:color w:val="1f2328"/>
                 <w:sz w:val="21"/>
               </w:rPr>
+              <w:t>数据层</w:t>
+            </w:r>
+          </w:p>
+        </w:tc>
+        <w:tc>
+          <w:tcPr>
+            <w:tcW w:w="2768" w:type="dxa"/>
+            <w:tcBorders>
+              <w:top w:val="single" w:color="c8d3e0" w:sz="6"/>
+              <w:left w:val="single" w:color="c8d3e0" w:sz="6"/>
+              <w:bottom w:val="single" w:color="c8d3e0" w:sz="6"/>
+              <w:right w:val="single" w:color="c8d3e0" w:sz="6"/>
+            </w:tcBorders>
+            <w:shd w:val="clear" w:fill="f5f7fa"/>
+            <w:tcMar>
+              <w:top w:w="90" w:type="dxa"/>
+              <w:left w:w="135" w:type="dxa"/>
+              <w:bottom w:w="90" w:type="dxa"/>
+              <w:right w:w="135" w:type="dxa"/>
+            </w:tcMar>
+            <w:vAlign w:val="top"/>
+          </w:tcPr>
+          <w:p>
+            <w:pPr>
+              <w:rPr>
+                <w:color w:val="1f2328"/>
+              </w:rPr>
+            </w:pPr>
+            <w:r>
+              <w:rPr>
+                <w:rFonts w:hint="eastAsia" w:ascii="SimSun" w:hAnsi="SimSun" w:eastAsia="SimSun" w:cs="SimSun"/>
+                <w:color w:val="1f2328"/>
+                <w:sz w:val="21"/>
+              </w:rPr>
+              <w:t>本地存储、导出与恢复备份、云端同步（可选）</w:t>
+            </w:r>
+          </w:p>
+        </w:tc>
+        <w:tc>
+          <w:tcPr>
+            <w:tcW w:w="2768" w:type="dxa"/>
+            <w:tcBorders>
+              <w:top w:val="single" w:color="c8d3e0" w:sz="6"/>
+              <w:left w:val="single" w:color="c8d3e0" w:sz="6"/>
+              <w:bottom w:val="single" w:color="c8d3e0" w:sz="6"/>
+              <w:right w:val="single" w:color="c8d3e0" w:sz="6"/>
+            </w:tcBorders>
+            <w:shd w:val="clear" w:fill="f5f7fa"/>
+            <w:tcMar>
+              <w:top w:w="90" w:type="dxa"/>
+              <w:left w:w="135" w:type="dxa"/>
+              <w:bottom w:w="90" w:type="dxa"/>
+              <w:right w:w="135" w:type="dxa"/>
+            </w:tcMar>
+            <w:vAlign w:val="top"/>
+          </w:tcPr>
+          <w:p>
+            <w:pPr>
+              <w:rPr>
+                <w:color w:val="1f2328"/>
+              </w:rPr>
+            </w:pPr>
+            <w:r>
+              <w:rPr>
+                <w:rFonts w:hint="eastAsia" w:ascii="SimSun" w:hAnsi="SimSun" w:eastAsia="SimSun" w:cs="SimSun"/>
+                <w:color w:val="1f2328"/>
+                <w:sz w:val="21"/>
+              </w:rPr>
+              <w:t>已实现</w:t>
+            </w:r>
+          </w:p>
+        </w:tc>
+      </w:tr>
+      <w:tr>
+        <w:trPr/>
+        <w:tc>
+          <w:tcPr>
+            <w:tcW w:w="2768" w:type="dxa"/>
+            <w:tcBorders>
+              <w:top w:val="single" w:color="c8d3e0" w:sz="6"/>
+              <w:left w:val="single" w:color="c8d3e0" w:sz="6"/>
+              <w:bottom w:val="single" w:color="c8d3e0" w:sz="6"/>
+              <w:right w:val="single" w:color="c8d3e0" w:sz="6"/>
+            </w:tcBorders>
+            <w:tcMar>
+              <w:top w:w="90" w:type="dxa"/>
+              <w:left w:w="135" w:type="dxa"/>
+              <w:bottom w:w="90" w:type="dxa"/>
+              <w:right w:w="135" w:type="dxa"/>
+            </w:tcMar>
+            <w:vAlign w:val="top"/>
+          </w:tcPr>
+          <w:p>
+            <w:pPr>
+              <w:rPr>
+                <w:color w:val="1f2328"/>
+              </w:rPr>
+            </w:pPr>
+            <w:r>
+              <w:rPr>
+                <w:rFonts w:hint="eastAsia" w:ascii="SimSun" w:hAnsi="SimSun" w:eastAsia="SimSun" w:cs="SimSun"/>
+                <w:color w:val="1f2328"/>
+                <w:sz w:val="21"/>
+              </w:rPr>
               <w:t>互通层</w:t>
             </w:r>
           </w:p>
@@ -6549,7 +6877,6 @@
               <w:bottom w:val="single" w:color="c8d3e0" w:sz="6"/>
               <w:right w:val="single" w:color="c8d3e0" w:sz="6"/>
             </w:tcBorders>
-            <w:shd w:val="clear" w:fill="f5f7fa"/>
             <w:tcMar>
               <w:top w:w="90" w:type="dxa"/>
               <w:left w:w="135" w:type="dxa"/>
@@ -6583,7 +6910,6 @@
               <w:bottom w:val="single" w:color="c8d3e0" w:sz="6"/>
               <w:right w:val="single" w:color="c8d3e0" w:sz="6"/>
             </w:tcBorders>
-            <w:shd w:val="clear" w:fill="f5f7fa"/>
             <w:tcMar>
               <w:top w:w="90" w:type="dxa"/>
               <w:left w:w="135" w:type="dxa"/>
@@ -11778,6 +12104,174 @@
           </w:p>
         </w:tc>
       </w:tr>
+      <w:tr>
+        <w:trPr/>
+        <w:tc>
+          <w:tcPr>
+            <w:tcW w:w="1661" w:type="dxa"/>
+            <w:tcBorders>
+              <w:top w:val="single" w:color="c8d3e0" w:sz="6"/>
+              <w:left w:val="single" w:color="c8d3e0" w:sz="6"/>
+              <w:bottom w:val="single" w:color="c8d3e0" w:sz="6"/>
+              <w:right w:val="single" w:color="c8d3e0" w:sz="6"/>
+            </w:tcBorders>
+            <w:tcMar>
+              <w:top w:w="90" w:type="dxa"/>
+              <w:left w:w="135" w:type="dxa"/>
+              <w:bottom w:w="90" w:type="dxa"/>
+              <w:right w:w="135" w:type="dxa"/>
+            </w:tcMar>
+            <w:vAlign w:val="top"/>
+          </w:tcPr>
+          <w:p>
+            <w:pPr>
+              <w:rPr>
+                <w:color w:val="1f2328"/>
+              </w:rPr>
+            </w:pPr>
+            <w:r>
+              <w:rPr>
+                <w:rFonts w:ascii="SimSun" w:hAnsi="SimSun" w:eastAsia="SimSun" w:cs="SimSun"/>
+                <w:color w:val="1f2328"/>
+                <w:sz w:val="21"/>
+              </w:rPr>
+              <w:t>FR-117</w:t>
+            </w:r>
+          </w:p>
+        </w:tc>
+        <w:tc>
+          <w:tcPr>
+            <w:tcW w:w="1661" w:type="dxa"/>
+            <w:tcBorders>
+              <w:top w:val="single" w:color="c8d3e0" w:sz="6"/>
+              <w:left w:val="single" w:color="c8d3e0" w:sz="6"/>
+              <w:bottom w:val="single" w:color="c8d3e0" w:sz="6"/>
+              <w:right w:val="single" w:color="c8d3e0" w:sz="6"/>
+            </w:tcBorders>
+            <w:tcMar>
+              <w:top w:w="90" w:type="dxa"/>
+              <w:left w:w="135" w:type="dxa"/>
+              <w:bottom w:w="90" w:type="dxa"/>
+              <w:right w:w="135" w:type="dxa"/>
+            </w:tcMar>
+            <w:vAlign w:val="top"/>
+          </w:tcPr>
+          <w:p>
+            <w:pPr>
+              <w:rPr>
+                <w:color w:val="1f2328"/>
+              </w:rPr>
+            </w:pPr>
+            <w:r>
+              <w:rPr>
+                <w:rFonts w:hint="eastAsia" w:ascii="SimSun" w:hAnsi="SimSun" w:eastAsia="SimSun" w:cs="SimSun"/>
+                <w:color w:val="1f2328"/>
+                <w:sz w:val="21"/>
+              </w:rPr>
+              <w:t>日历（阴阳历）</w:t>
+            </w:r>
+          </w:p>
+        </w:tc>
+        <w:tc>
+          <w:tcPr>
+            <w:tcW w:w="1661" w:type="dxa"/>
+            <w:tcBorders>
+              <w:top w:val="single" w:color="c8d3e0" w:sz="6"/>
+              <w:left w:val="single" w:color="c8d3e0" w:sz="6"/>
+              <w:bottom w:val="single" w:color="c8d3e0" w:sz="6"/>
+              <w:right w:val="single" w:color="c8d3e0" w:sz="6"/>
+            </w:tcBorders>
+            <w:tcMar>
+              <w:top w:w="90" w:type="dxa"/>
+              <w:left w:w="135" w:type="dxa"/>
+              <w:bottom w:w="90" w:type="dxa"/>
+              <w:right w:w="135" w:type="dxa"/>
+            </w:tcMar>
+            <w:vAlign w:val="top"/>
+          </w:tcPr>
+          <w:p>
+            <w:pPr>
+              <w:rPr>
+                <w:color w:val="1f2328"/>
+              </w:rPr>
+            </w:pPr>
+            <w:r>
+              <w:rPr>
+                <w:rFonts w:ascii="SimSun" w:hAnsi="SimSun" w:eastAsia="SimSun" w:cs="SimSun"/>
+                <w:color w:val="1f2328"/>
+                <w:sz w:val="21"/>
+              </w:rPr>
+              <w:t>P0</w:t>
+            </w:r>
+          </w:p>
+        </w:tc>
+        <w:tc>
+          <w:tcPr>
+            <w:tcW w:w="1661" w:type="dxa"/>
+            <w:tcBorders>
+              <w:top w:val="single" w:color="c8d3e0" w:sz="6"/>
+              <w:left w:val="single" w:color="c8d3e0" w:sz="6"/>
+              <w:bottom w:val="single" w:color="c8d3e0" w:sz="6"/>
+              <w:right w:val="single" w:color="c8d3e0" w:sz="6"/>
+            </w:tcBorders>
+            <w:tcMar>
+              <w:top w:w="90" w:type="dxa"/>
+              <w:left w:w="135" w:type="dxa"/>
+              <w:bottom w:w="90" w:type="dxa"/>
+              <w:right w:w="135" w:type="dxa"/>
+            </w:tcMar>
+            <w:vAlign w:val="top"/>
+          </w:tcPr>
+          <w:p>
+            <w:pPr>
+              <w:rPr>
+                <w:color w:val="1f2328"/>
+              </w:rPr>
+            </w:pPr>
+            <w:r>
+              <w:rPr>
+                <w:rFonts w:hint="eastAsia" w:ascii="SimSun" w:hAnsi="SimSun" w:eastAsia="SimSun" w:cs="SimSun"/>
+                <w:color w:val="1f2328"/>
+                <w:sz w:val="21"/>
+              </w:rPr>
+              <w:t>月视图网格，格内同时显示公历日期与农历日期；今日高亮；打卡日与有记录日分级着色</w:t>
+            </w:r>
+          </w:p>
+        </w:tc>
+        <w:tc>
+          <w:tcPr>
+            <w:tcW w:w="1661" w:type="dxa"/>
+            <w:tcBorders>
+              <w:top w:val="single" w:color="c8d3e0" w:sz="6"/>
+              <w:left w:val="single" w:color="c8d3e0" w:sz="6"/>
+              <w:bottom w:val="single" w:color="c8d3e0" w:sz="6"/>
+              <w:right w:val="single" w:color="c8d3e0" w:sz="6"/>
+            </w:tcBorders>
+            <w:tcMar>
+              <w:top w:w="90" w:type="dxa"/>
+              <w:left w:w="135" w:type="dxa"/>
+              <w:bottom w:w="90" w:type="dxa"/>
+              <w:right w:w="135" w:type="dxa"/>
+            </w:tcMar>
+            <w:vAlign w:val="top"/>
+          </w:tcPr>
+          <w:p>
+            <w:pPr>
+              <w:rPr>
+                <w:color w:val="1f2328"/>
+              </w:rPr>
+            </w:pPr>
+            <w:r>
+              <w:rPr>
+                <w:rFonts w:hint="eastAsia" w:ascii="SimSun" w:hAnsi="SimSun" w:eastAsia="SimSun" w:cs="SimSun"/>
+                <w:color w:val="1f2328"/>
+                <w:sz w:val="21"/>
+              </w:rPr>
+              <w:t>当天格子高亮且可辨识；翻月（上月 / 下月 / 回到本月）正常；手机与桌面宽度均不横向溢出</w:t>
+            </w:r>
+          </w:p>
+        </w:tc>
+      </w:tr>
     </w:tbl>
     <w:p>
       <w:pPr>
@@ -12392,6 +12886,452 @@
           </w:p>
         </w:tc>
       </w:tr>
+      <w:tr>
+        <w:trPr/>
+        <w:tc>
+          <w:tcPr>
+            <w:tcW w:w="2076" w:type="dxa"/>
+            <w:tcBorders>
+              <w:top w:val="single" w:color="c8d3e0" w:sz="6"/>
+              <w:left w:val="single" w:color="c8d3e0" w:sz="6"/>
+              <w:bottom w:val="single" w:color="c8d3e0" w:sz="6"/>
+              <w:right w:val="single" w:color="c8d3e0" w:sz="6"/>
+            </w:tcBorders>
+            <w:shd w:val="clear" w:fill="f5f7fa"/>
+            <w:tcMar>
+              <w:top w:w="90" w:type="dxa"/>
+              <w:left w:w="135" w:type="dxa"/>
+              <w:bottom w:w="90" w:type="dxa"/>
+              <w:right w:w="135" w:type="dxa"/>
+            </w:tcMar>
+            <w:vAlign w:val="top"/>
+          </w:tcPr>
+          <w:p>
+            <w:pPr>
+              <w:rPr>
+                <w:color w:val="1f2328"/>
+              </w:rPr>
+            </w:pPr>
+            <w:r>
+              <w:rPr>
+                <w:rFonts w:ascii="SimSun" w:hAnsi="SimSun" w:eastAsia="SimSun" w:cs="SimSun"/>
+                <w:color w:val="1f2328"/>
+                <w:sz w:val="21"/>
+              </w:rPr>
+              <w:t>FR-204</w:t>
+            </w:r>
+          </w:p>
+        </w:tc>
+        <w:tc>
+          <w:tcPr>
+            <w:tcW w:w="2076" w:type="dxa"/>
+            <w:tcBorders>
+              <w:top w:val="single" w:color="c8d3e0" w:sz="6"/>
+              <w:left w:val="single" w:color="c8d3e0" w:sz="6"/>
+              <w:bottom w:val="single" w:color="c8d3e0" w:sz="6"/>
+              <w:right w:val="single" w:color="c8d3e0" w:sz="6"/>
+            </w:tcBorders>
+            <w:shd w:val="clear" w:fill="f5f7fa"/>
+            <w:tcMar>
+              <w:top w:w="90" w:type="dxa"/>
+              <w:left w:w="135" w:type="dxa"/>
+              <w:bottom w:w="90" w:type="dxa"/>
+              <w:right w:w="135" w:type="dxa"/>
+            </w:tcMar>
+            <w:vAlign w:val="top"/>
+          </w:tcPr>
+          <w:p>
+            <w:pPr>
+              <w:rPr>
+                <w:color w:val="1f2328"/>
+              </w:rPr>
+            </w:pPr>
+            <w:r>
+              <w:rPr>
+                <w:rFonts w:ascii="SimSun" w:hAnsi="SimSun" w:eastAsia="SimSun" w:cs="SimSun"/>
+                <w:color w:val="1f2328"/>
+                <w:sz w:val="21"/>
+              </w:rPr>
+              <w:t>P0</w:t>
+            </w:r>
+          </w:p>
+        </w:tc>
+        <w:tc>
+          <w:tcPr>
+            <w:tcW w:w="2076" w:type="dxa"/>
+            <w:tcBorders>
+              <w:top w:val="single" w:color="c8d3e0" w:sz="6"/>
+              <w:left w:val="single" w:color="c8d3e0" w:sz="6"/>
+              <w:bottom w:val="single" w:color="c8d3e0" w:sz="6"/>
+              <w:right w:val="single" w:color="c8d3e0" w:sz="6"/>
+            </w:tcBorders>
+            <w:shd w:val="clear" w:fill="f5f7fa"/>
+            <w:tcMar>
+              <w:top w:w="90" w:type="dxa"/>
+              <w:left w:w="135" w:type="dxa"/>
+              <w:bottom w:w="90" w:type="dxa"/>
+              <w:right w:w="135" w:type="dxa"/>
+            </w:tcMar>
+            <w:vAlign w:val="top"/>
+          </w:tcPr>
+          <w:p>
+            <w:pPr>
+              <w:rPr>
+                <w:color w:val="1f2328"/>
+              </w:rPr>
+            </w:pPr>
+            <w:r>
+              <w:rPr>
+                <w:rFonts w:hint="eastAsia" w:ascii="SimSun" w:hAnsi="SimSun" w:eastAsia="SimSun" w:cs="SimSun"/>
+                <w:color w:val="1f2328"/>
+                <w:sz w:val="21"/>
+              </w:rPr>
+              <w:t>农历换算（阴历）</w:t>
+            </w:r>
+          </w:p>
+        </w:tc>
+        <w:tc>
+          <w:tcPr>
+            <w:tcW w:w="2076" w:type="dxa"/>
+            <w:tcBorders>
+              <w:top w:val="single" w:color="c8d3e0" w:sz="6"/>
+              <w:left w:val="single" w:color="c8d3e0" w:sz="6"/>
+              <w:bottom w:val="single" w:color="c8d3e0" w:sz="6"/>
+              <w:right w:val="single" w:color="c8d3e0" w:sz="6"/>
+            </w:tcBorders>
+            <w:shd w:val="clear" w:fill="f5f7fa"/>
+            <w:tcMar>
+              <w:top w:w="90" w:type="dxa"/>
+              <w:left w:w="135" w:type="dxa"/>
+              <w:bottom w:w="90" w:type="dxa"/>
+              <w:right w:w="135" w:type="dxa"/>
+            </w:tcMar>
+            <w:vAlign w:val="top"/>
+          </w:tcPr>
+          <w:p>
+            <w:pPr>
+              <w:rPr>
+                <w:color w:val="1f2328"/>
+              </w:rPr>
+            </w:pPr>
+            <w:r>
+              <w:rPr>
+                <w:rFonts w:hint="eastAsia" w:ascii="SimSun" w:hAnsi="SimSun" w:eastAsia="SimSun" w:cs="SimSun"/>
+                <w:color w:val="1f2328"/>
+                <w:sz w:val="21"/>
+              </w:rPr>
+              <w:t>覆盖 1900 至 2100 年，含闰月；支持显示干支纪年与生肖。纯本地算法，不依赖网络与第三方库</w:t>
+            </w:r>
+            <w:r>
+              <w:br w:type="textWrapping"/>
+            </w:r>
+            <w:r>
+              <w:rPr>
+                <w:rFonts w:hint="eastAsia" w:ascii="SimSun" w:hAnsi="SimSun" w:eastAsia="SimSun" w:cs="SimSun"/>
+                <w:color w:val="1f2328"/>
+                <w:sz w:val="21"/>
+              </w:rPr>
+              <w:t>已知日期对照正确：2026-02-17 为正月初一、2025-10-06 为八月十五、2023-03-22 为闰二月初一</w:t>
+            </w:r>
+          </w:p>
+        </w:tc>
+      </w:tr>
+      <w:tr>
+        <w:trPr/>
+        <w:tc>
+          <w:tcPr>
+            <w:tcW w:w="2076" w:type="dxa"/>
+            <w:tcBorders>
+              <w:top w:val="single" w:color="c8d3e0" w:sz="6"/>
+              <w:left w:val="single" w:color="c8d3e0" w:sz="6"/>
+              <w:bottom w:val="single" w:color="c8d3e0" w:sz="6"/>
+              <w:right w:val="single" w:color="c8d3e0" w:sz="6"/>
+            </w:tcBorders>
+            <w:tcMar>
+              <w:top w:w="90" w:type="dxa"/>
+              <w:left w:w="135" w:type="dxa"/>
+              <w:bottom w:w="90" w:type="dxa"/>
+              <w:right w:w="135" w:type="dxa"/>
+            </w:tcMar>
+            <w:vAlign w:val="top"/>
+          </w:tcPr>
+          <w:p>
+            <w:pPr>
+              <w:rPr>
+                <w:color w:val="1f2328"/>
+              </w:rPr>
+            </w:pPr>
+            <w:r>
+              <w:rPr>
+                <w:rFonts w:ascii="SimSun" w:hAnsi="SimSun" w:eastAsia="SimSun" w:cs="SimSun"/>
+                <w:color w:val="1f2328"/>
+                <w:sz w:val="21"/>
+              </w:rPr>
+              <w:t>FR-205</w:t>
+            </w:r>
+          </w:p>
+        </w:tc>
+        <w:tc>
+          <w:tcPr>
+            <w:tcW w:w="2076" w:type="dxa"/>
+            <w:tcBorders>
+              <w:top w:val="single" w:color="c8d3e0" w:sz="6"/>
+              <w:left w:val="single" w:color="c8d3e0" w:sz="6"/>
+              <w:bottom w:val="single" w:color="c8d3e0" w:sz="6"/>
+              <w:right w:val="single" w:color="c8d3e0" w:sz="6"/>
+            </w:tcBorders>
+            <w:tcMar>
+              <w:top w:w="90" w:type="dxa"/>
+              <w:left w:w="135" w:type="dxa"/>
+              <w:bottom w:w="90" w:type="dxa"/>
+              <w:right w:w="135" w:type="dxa"/>
+            </w:tcMar>
+            <w:vAlign w:val="top"/>
+          </w:tcPr>
+          <w:p>
+            <w:pPr>
+              <w:rPr>
+                <w:color w:val="1f2328"/>
+              </w:rPr>
+            </w:pPr>
+            <w:r>
+              <w:rPr>
+                <w:rFonts w:ascii="SimSun" w:hAnsi="SimSun" w:eastAsia="SimSun" w:cs="SimSun"/>
+                <w:color w:val="1f2328"/>
+                <w:sz w:val="21"/>
+              </w:rPr>
+              <w:t>P0</w:t>
+            </w:r>
+          </w:p>
+        </w:tc>
+        <w:tc>
+          <w:tcPr>
+            <w:tcW w:w="2076" w:type="dxa"/>
+            <w:tcBorders>
+              <w:top w:val="single" w:color="c8d3e0" w:sz="6"/>
+              <w:left w:val="single" w:color="c8d3e0" w:sz="6"/>
+              <w:bottom w:val="single" w:color="c8d3e0" w:sz="6"/>
+              <w:right w:val="single" w:color="c8d3e0" w:sz="6"/>
+            </w:tcBorders>
+            <w:tcMar>
+              <w:top w:w="90" w:type="dxa"/>
+              <w:left w:w="135" w:type="dxa"/>
+              <w:bottom w:w="90" w:type="dxa"/>
+              <w:right w:w="135" w:type="dxa"/>
+            </w:tcMar>
+            <w:vAlign w:val="top"/>
+          </w:tcPr>
+          <w:p>
+            <w:pPr>
+              <w:rPr>
+                <w:color w:val="1f2328"/>
+              </w:rPr>
+            </w:pPr>
+            <w:r>
+              <w:rPr>
+                <w:rFonts w:hint="eastAsia" w:ascii="SimSun" w:hAnsi="SimSun" w:eastAsia="SimSun" w:cs="SimSun"/>
+                <w:color w:val="1f2328"/>
+                <w:sz w:val="21"/>
+              </w:rPr>
+              <w:t>二十四节气</w:t>
+            </w:r>
+          </w:p>
+        </w:tc>
+        <w:tc>
+          <w:tcPr>
+            <w:tcW w:w="2076" w:type="dxa"/>
+            <w:tcBorders>
+              <w:top w:val="single" w:color="c8d3e0" w:sz="6"/>
+              <w:left w:val="single" w:color="c8d3e0" w:sz="6"/>
+              <w:bottom w:val="single" w:color="c8d3e0" w:sz="6"/>
+              <w:right w:val="single" w:color="c8d3e0" w:sz="6"/>
+            </w:tcBorders>
+            <w:tcMar>
+              <w:top w:w="90" w:type="dxa"/>
+              <w:left w:w="135" w:type="dxa"/>
+              <w:bottom w:w="90" w:type="dxa"/>
+              <w:right w:w="135" w:type="dxa"/>
+            </w:tcMar>
+            <w:vAlign w:val="top"/>
+          </w:tcPr>
+          <w:p>
+            <w:pPr>
+              <w:rPr>
+                <w:color w:val="1f2328"/>
+              </w:rPr>
+            </w:pPr>
+            <w:r>
+              <w:rPr>
+                <w:rFonts w:hint="eastAsia" w:ascii="SimSun" w:hAnsi="SimSun" w:eastAsia="SimSun" w:cs="SimSun"/>
+                <w:color w:val="1f2328"/>
+                <w:sz w:val="21"/>
+              </w:rPr>
+              <w:t>用太阳视黄经天文算法计算，按北京时间取值；不得使用会整体偏移的经验公式</w:t>
+            </w:r>
+            <w:r>
+              <w:br w:type="textWrapping"/>
+            </w:r>
+            <w:r>
+              <w:rPr>
+                <w:rFonts w:hint="eastAsia" w:ascii="SimSun" w:hAnsi="SimSun" w:eastAsia="SimSun" w:cs="SimSun"/>
+                <w:color w:val="1f2328"/>
+                <w:sz w:val="21"/>
+              </w:rPr>
+              <w:t>闰年不偏移：2024 年立春 2 月 4 日、清明 4 月 4 日、冬至 12 月 21 日；2026 年立春 2 月 4 日</w:t>
+            </w:r>
+          </w:p>
+        </w:tc>
+      </w:tr>
+      <w:tr>
+        <w:trPr/>
+        <w:tc>
+          <w:tcPr>
+            <w:tcW w:w="2076" w:type="dxa"/>
+            <w:tcBorders>
+              <w:top w:val="single" w:color="c8d3e0" w:sz="6"/>
+              <w:left w:val="single" w:color="c8d3e0" w:sz="6"/>
+              <w:bottom w:val="single" w:color="c8d3e0" w:sz="6"/>
+              <w:right w:val="single" w:color="c8d3e0" w:sz="6"/>
+            </w:tcBorders>
+            <w:shd w:val="clear" w:fill="f5f7fa"/>
+            <w:tcMar>
+              <w:top w:w="90" w:type="dxa"/>
+              <w:left w:w="135" w:type="dxa"/>
+              <w:bottom w:w="90" w:type="dxa"/>
+              <w:right w:w="135" w:type="dxa"/>
+            </w:tcMar>
+            <w:vAlign w:val="top"/>
+          </w:tcPr>
+          <w:p>
+            <w:pPr>
+              <w:rPr>
+                <w:color w:val="1f2328"/>
+              </w:rPr>
+            </w:pPr>
+            <w:r>
+              <w:rPr>
+                <w:rFonts w:ascii="SimSun" w:hAnsi="SimSun" w:eastAsia="SimSun" w:cs="SimSun"/>
+                <w:color w:val="1f2328"/>
+                <w:sz w:val="21"/>
+              </w:rPr>
+              <w:t>FR-206</w:t>
+            </w:r>
+          </w:p>
+        </w:tc>
+        <w:tc>
+          <w:tcPr>
+            <w:tcW w:w="2076" w:type="dxa"/>
+            <w:tcBorders>
+              <w:top w:val="single" w:color="c8d3e0" w:sz="6"/>
+              <w:left w:val="single" w:color="c8d3e0" w:sz="6"/>
+              <w:bottom w:val="single" w:color="c8d3e0" w:sz="6"/>
+              <w:right w:val="single" w:color="c8d3e0" w:sz="6"/>
+            </w:tcBorders>
+            <w:shd w:val="clear" w:fill="f5f7fa"/>
+            <w:tcMar>
+              <w:top w:w="90" w:type="dxa"/>
+              <w:left w:w="135" w:type="dxa"/>
+              <w:bottom w:w="90" w:type="dxa"/>
+              <w:right w:w="135" w:type="dxa"/>
+            </w:tcMar>
+            <w:vAlign w:val="top"/>
+          </w:tcPr>
+          <w:p>
+            <w:pPr>
+              <w:rPr>
+                <w:color w:val="1f2328"/>
+              </w:rPr>
+            </w:pPr>
+            <w:r>
+              <w:rPr>
+                <w:rFonts w:ascii="SimSun" w:hAnsi="SimSun" w:eastAsia="SimSun" w:cs="SimSun"/>
+                <w:color w:val="1f2328"/>
+                <w:sz w:val="21"/>
+              </w:rPr>
+              <w:t>P1</w:t>
+            </w:r>
+          </w:p>
+        </w:tc>
+        <w:tc>
+          <w:tcPr>
+            <w:tcW w:w="2076" w:type="dxa"/>
+            <w:tcBorders>
+              <w:top w:val="single" w:color="c8d3e0" w:sz="6"/>
+              <w:left w:val="single" w:color="c8d3e0" w:sz="6"/>
+              <w:bottom w:val="single" w:color="c8d3e0" w:sz="6"/>
+              <w:right w:val="single" w:color="c8d3e0" w:sz="6"/>
+            </w:tcBorders>
+            <w:shd w:val="clear" w:fill="f5f7fa"/>
+            <w:tcMar>
+              <w:top w:w="90" w:type="dxa"/>
+              <w:left w:w="135" w:type="dxa"/>
+              <w:bottom w:w="90" w:type="dxa"/>
+              <w:right w:w="135" w:type="dxa"/>
+            </w:tcMar>
+            <w:vAlign w:val="top"/>
+          </w:tcPr>
+          <w:p>
+            <w:pPr>
+              <w:rPr>
+                <w:color w:val="1f2328"/>
+              </w:rPr>
+            </w:pPr>
+            <w:r>
+              <w:rPr>
+                <w:rFonts w:hint="eastAsia" w:ascii="SimSun" w:hAnsi="SimSun" w:eastAsia="SimSun" w:cs="SimSun"/>
+                <w:color w:val="1f2328"/>
+                <w:sz w:val="21"/>
+              </w:rPr>
+              <w:t>节日与节气展示规则</w:t>
+            </w:r>
+          </w:p>
+        </w:tc>
+        <w:tc>
+          <w:tcPr>
+            <w:tcW w:w="2076" w:type="dxa"/>
+            <w:tcBorders>
+              <w:top w:val="single" w:color="c8d3e0" w:sz="6"/>
+              <w:left w:val="single" w:color="c8d3e0" w:sz="6"/>
+              <w:bottom w:val="single" w:color="c8d3e0" w:sz="6"/>
+              <w:right w:val="single" w:color="c8d3e0" w:sz="6"/>
+            </w:tcBorders>
+            <w:shd w:val="clear" w:fill="f5f7fa"/>
+            <w:tcMar>
+              <w:top w:w="90" w:type="dxa"/>
+              <w:left w:w="135" w:type="dxa"/>
+              <w:bottom w:w="90" w:type="dxa"/>
+              <w:right w:w="135" w:type="dxa"/>
+            </w:tcMar>
+            <w:vAlign w:val="top"/>
+          </w:tcPr>
+          <w:p>
+            <w:pPr>
+              <w:rPr>
+                <w:color w:val="1f2328"/>
+              </w:rPr>
+            </w:pPr>
+            <w:r>
+              <w:rPr>
+                <w:rFonts w:hint="eastAsia" w:ascii="SimSun" w:hAnsi="SimSun" w:eastAsia="SimSun" w:cs="SimSun"/>
+                <w:color w:val="1f2328"/>
+                <w:sz w:val="21"/>
+              </w:rPr>
+              <w:t>优先级为：农历节日 &gt; 节气 &gt; 公历节日 &gt; 农历日（初一显示月份名）；页面底部列出本月节气与节日</w:t>
+            </w:r>
+            <w:r>
+              <w:br w:type="textWrapping"/>
+            </w:r>
+            <w:r>
+              <w:rPr>
+                <w:rFonts w:hint="eastAsia" w:ascii="SimSun" w:hAnsi="SimSun" w:eastAsia="SimSun" w:cs="SimSun"/>
+                <w:color w:val="1f2328"/>
+                <w:sz w:val="21"/>
+              </w:rPr>
+              <w:t>2026-10-01 显示国庆节；2026-02-17 显示春节；2026-10-08 显示寒露</w:t>
+            </w:r>
+          </w:p>
+        </w:tc>
+      </w:tr>
     </w:tbl>
     <w:p>
       <w:pPr>
@@ -13005,6 +13945,77 @@
                 <w:sz w:val="21"/>
               </w:rPr>
               <w:t>双端共享同一套领域逻辑命名（如 searchAll、dayLevel、tlNodes），便于同步演进</w:t>
+            </w:r>
+          </w:p>
+        </w:tc>
+      </w:tr>
+      <w:tr>
+        <w:trPr/>
+        <w:tc>
+          <w:tcPr>
+            <w:tcW w:w="4153" w:type="dxa"/>
+            <w:tcBorders>
+              <w:top w:val="single" w:color="c8d3e0" w:sz="6"/>
+              <w:left w:val="single" w:color="c8d3e0" w:sz="6"/>
+              <w:bottom w:val="single" w:color="c8d3e0" w:sz="6"/>
+              <w:right w:val="single" w:color="c8d3e0" w:sz="6"/>
+            </w:tcBorders>
+            <w:shd w:val="clear" w:fill="f5f7fa"/>
+            <w:tcMar>
+              <w:top w:w="90" w:type="dxa"/>
+              <w:left w:w="135" w:type="dxa"/>
+              <w:bottom w:w="90" w:type="dxa"/>
+              <w:right w:w="135" w:type="dxa"/>
+            </w:tcMar>
+            <w:vAlign w:val="top"/>
+          </w:tcPr>
+          <w:p>
+            <w:pPr>
+              <w:rPr>
+                <w:color w:val="1f2328"/>
+              </w:rPr>
+            </w:pPr>
+            <w:r>
+              <w:rPr>
+                <w:rFonts w:hint="eastAsia" w:ascii="SimSun" w:hAnsi="SimSun" w:eastAsia="SimSun" w:cs="SimSun"/>
+                <w:color w:val="1f2328"/>
+                <w:sz w:val="21"/>
+              </w:rPr>
+              <w:t>算法可靠性</w:t>
+            </w:r>
+          </w:p>
+        </w:tc>
+        <w:tc>
+          <w:tcPr>
+            <w:tcW w:w="4153" w:type="dxa"/>
+            <w:tcBorders>
+              <w:top w:val="single" w:color="c8d3e0" w:sz="6"/>
+              <w:left w:val="single" w:color="c8d3e0" w:sz="6"/>
+              <w:bottom w:val="single" w:color="c8d3e0" w:sz="6"/>
+              <w:right w:val="single" w:color="c8d3e0" w:sz="6"/>
+            </w:tcBorders>
+            <w:shd w:val="clear" w:fill="f5f7fa"/>
+            <w:tcMar>
+              <w:top w:w="90" w:type="dxa"/>
+              <w:left w:w="135" w:type="dxa"/>
+              <w:bottom w:w="90" w:type="dxa"/>
+              <w:right w:w="135" w:type="dxa"/>
+            </w:tcMar>
+            <w:vAlign w:val="top"/>
+          </w:tcPr>
+          <w:p>
+            <w:pPr>
+              <w:rPr>
+                <w:color w:val="1f2328"/>
+              </w:rPr>
+            </w:pPr>
+            <w:r>
+              <w:rPr>
+                <w:rFonts w:hint="eastAsia" w:ascii="SimSun" w:hAnsi="SimSun" w:eastAsia="SimSun" w:cs="SimSun"/>
+                <w:color w:val="1f2328"/>
+                <w:sz w:val="21"/>
+              </w:rPr>
+              <w:t>历法换算与节气计算全部本地完成、无网络依赖；算法需有单测覆盖并按权威万年历逐条比对</w:t>
             </w:r>
           </w:p>
         </w:tc>
@@ -15557,6 +16568,146 @@
           </w:p>
         </w:tc>
       </w:tr>
+      <w:tr>
+        <w:trPr/>
+        <w:tc>
+          <w:tcPr>
+            <w:tcW w:w="4153" w:type="dxa"/>
+            <w:tcBorders>
+              <w:top w:val="single" w:color="c8d3e0" w:sz="6"/>
+              <w:left w:val="single" w:color="c8d3e0" w:sz="6"/>
+              <w:bottom w:val="single" w:color="c8d3e0" w:sz="6"/>
+              <w:right w:val="single" w:color="c8d3e0" w:sz="6"/>
+            </w:tcBorders>
+            <w:tcMar>
+              <w:top w:w="90" w:type="dxa"/>
+              <w:left w:w="135" w:type="dxa"/>
+              <w:bottom w:w="90" w:type="dxa"/>
+              <w:right w:w="135" w:type="dxa"/>
+            </w:tcMar>
+            <w:vAlign w:val="top"/>
+          </w:tcPr>
+          <w:p>
+            <w:pPr>
+              <w:rPr>
+                <w:color w:val="1f2328"/>
+              </w:rPr>
+            </w:pPr>
+            <w:r>
+              <w:rPr>
+                <w:rFonts w:hint="eastAsia" w:ascii="SimSun" w:hAnsi="SimSun" w:eastAsia="SimSun" w:cs="SimSun"/>
+                <w:color w:val="1f2328"/>
+                <w:sz w:val="21"/>
+              </w:rPr>
+              <w:t>节气经验公式（寿星公式）在闰年整体偏移一天</w:t>
+            </w:r>
+          </w:p>
+        </w:tc>
+        <w:tc>
+          <w:tcPr>
+            <w:tcW w:w="4153" w:type="dxa"/>
+            <w:tcBorders>
+              <w:top w:val="single" w:color="c8d3e0" w:sz="6"/>
+              <w:left w:val="single" w:color="c8d3e0" w:sz="6"/>
+              <w:bottom w:val="single" w:color="c8d3e0" w:sz="6"/>
+              <w:right w:val="single" w:color="c8d3e0" w:sz="6"/>
+            </w:tcBorders>
+            <w:tcMar>
+              <w:top w:w="90" w:type="dxa"/>
+              <w:left w:w="135" w:type="dxa"/>
+              <w:bottom w:w="90" w:type="dxa"/>
+              <w:right w:w="135" w:type="dxa"/>
+            </w:tcMar>
+            <w:vAlign w:val="top"/>
+          </w:tcPr>
+          <w:p>
+            <w:pPr>
+              <w:rPr>
+                <w:color w:val="1f2328"/>
+              </w:rPr>
+            </w:pPr>
+            <w:r>
+              <w:rPr>
+                <w:rFonts w:hint="eastAsia" w:ascii="SimSun" w:hAnsi="SimSun" w:eastAsia="SimSun" w:cs="SimSun"/>
+                <w:color w:val="1f2328"/>
+                <w:sz w:val="21"/>
+              </w:rPr>
+              <w:t>改用太阳视黄经天文算法，二分求交点后按北京时间取值</w:t>
+            </w:r>
+          </w:p>
+        </w:tc>
+      </w:tr>
+      <w:tr>
+        <w:trPr/>
+        <w:tc>
+          <w:tcPr>
+            <w:tcW w:w="4153" w:type="dxa"/>
+            <w:tcBorders>
+              <w:top w:val="single" w:color="c8d3e0" w:sz="6"/>
+              <w:left w:val="single" w:color="c8d3e0" w:sz="6"/>
+              <w:bottom w:val="single" w:color="c8d3e0" w:sz="6"/>
+              <w:right w:val="single" w:color="c8d3e0" w:sz="6"/>
+            </w:tcBorders>
+            <w:shd w:val="clear" w:fill="f5f7fa"/>
+            <w:tcMar>
+              <w:top w:w="90" w:type="dxa"/>
+              <w:left w:w="135" w:type="dxa"/>
+              <w:bottom w:w="90" w:type="dxa"/>
+              <w:right w:w="135" w:type="dxa"/>
+            </w:tcMar>
+            <w:vAlign w:val="top"/>
+          </w:tcPr>
+          <w:p>
+            <w:pPr>
+              <w:rPr>
+                <w:color w:val="1f2328"/>
+              </w:rPr>
+            </w:pPr>
+            <w:r>
+              <w:rPr>
+                <w:rFonts w:hint="eastAsia" w:ascii="SimSun" w:hAnsi="SimSun" w:eastAsia="SimSun" w:cs="SimSun"/>
+                <w:color w:val="1f2328"/>
+                <w:sz w:val="21"/>
+              </w:rPr>
+              <w:t>农历日「初十以上」名称拼接易错</w:t>
+            </w:r>
+          </w:p>
+        </w:tc>
+        <w:tc>
+          <w:tcPr>
+            <w:tcW w:w="4153" w:type="dxa"/>
+            <w:tcBorders>
+              <w:top w:val="single" w:color="c8d3e0" w:sz="6"/>
+              <w:left w:val="single" w:color="c8d3e0" w:sz="6"/>
+              <w:bottom w:val="single" w:color="c8d3e0" w:sz="6"/>
+              <w:right w:val="single" w:color="c8d3e0" w:sz="6"/>
+            </w:tcBorders>
+            <w:shd w:val="clear" w:fill="f5f7fa"/>
+            <w:tcMar>
+              <w:top w:w="90" w:type="dxa"/>
+              <w:left w:w="135" w:type="dxa"/>
+              <w:bottom w:w="90" w:type="dxa"/>
+              <w:right w:w="135" w:type="dxa"/>
+            </w:tcMar>
+            <w:vAlign w:val="top"/>
+          </w:tcPr>
+          <w:p>
+            <w:pPr>
+              <w:rPr>
+                <w:color w:val="1f2328"/>
+              </w:rPr>
+            </w:pPr>
+            <w:r>
+              <w:rPr>
+                <w:rFonts w:hint="eastAsia" w:ascii="SimSun" w:hAnsi="SimSun" w:eastAsia="SimSun" w:cs="SimSun"/>
+                <w:color w:val="1f2328"/>
+                <w:sz w:val="21"/>
+              </w:rPr>
+              <w:t>三十天名称改为查表，不再按位拼接</w:t>
+            </w:r>
+          </w:p>
+        </w:tc>
+      </w:tr>
     </w:tbl>
     <w:p>
       <w:pPr>
@@ -16169,7 +17320,7 @@
                 <w:color w:val="1f2328"/>
                 <w:sz w:val="21"/>
               </w:rPr>
-              <w:t>M5 推送与互通</w:t>
+              <w:t>M5 阴阳历日历</w:t>
             </w:r>
           </w:p>
         </w:tc>
@@ -16202,6 +17353,110 @@
                 <w:color w:val="1f2328"/>
                 <w:sz w:val="21"/>
               </w:rPr>
+              <w:t>农历换算、二十四节气、传统节日与公历节日、点某天看记录</w:t>
+            </w:r>
+          </w:p>
+        </w:tc>
+        <w:tc>
+          <w:tcPr>
+            <w:tcW w:w="2768" w:type="dxa"/>
+            <w:tcBorders>
+              <w:top w:val="single" w:color="c8d3e0" w:sz="6"/>
+              <w:left w:val="single" w:color="c8d3e0" w:sz="6"/>
+              <w:bottom w:val="single" w:color="c8d3e0" w:sz="6"/>
+              <w:right w:val="single" w:color="c8d3e0" w:sz="6"/>
+            </w:tcBorders>
+            <w:tcMar>
+              <w:top w:w="90" w:type="dxa"/>
+              <w:left w:w="135" w:type="dxa"/>
+              <w:bottom w:w="90" w:type="dxa"/>
+              <w:right w:w="135" w:type="dxa"/>
+            </w:tcMar>
+            <w:vAlign w:val="top"/>
+          </w:tcPr>
+          <w:p>
+            <w:pPr>
+              <w:rPr>
+                <w:color w:val="1f2328"/>
+              </w:rPr>
+            </w:pPr>
+            <w:r>
+              <w:rPr>
+                <w:rFonts w:hint="eastAsia" w:ascii="SimSun" w:hAnsi="SimSun" w:eastAsia="SimSun" w:cs="SimSun"/>
+                <w:color w:val="1f2328"/>
+                <w:sz w:val="21"/>
+              </w:rPr>
+              <w:t>已完成</w:t>
+            </w:r>
+          </w:p>
+        </w:tc>
+      </w:tr>
+      <w:tr>
+        <w:trPr/>
+        <w:tc>
+          <w:tcPr>
+            <w:tcW w:w="2768" w:type="dxa"/>
+            <w:tcBorders>
+              <w:top w:val="single" w:color="c8d3e0" w:sz="6"/>
+              <w:left w:val="single" w:color="c8d3e0" w:sz="6"/>
+              <w:bottom w:val="single" w:color="c8d3e0" w:sz="6"/>
+              <w:right w:val="single" w:color="c8d3e0" w:sz="6"/>
+            </w:tcBorders>
+            <w:shd w:val="clear" w:fill="f5f7fa"/>
+            <w:tcMar>
+              <w:top w:w="90" w:type="dxa"/>
+              <w:left w:w="135" w:type="dxa"/>
+              <w:bottom w:w="90" w:type="dxa"/>
+              <w:right w:w="135" w:type="dxa"/>
+            </w:tcMar>
+            <w:vAlign w:val="top"/>
+          </w:tcPr>
+          <w:p>
+            <w:pPr>
+              <w:rPr>
+                <w:color w:val="1f2328"/>
+              </w:rPr>
+            </w:pPr>
+            <w:r>
+              <w:rPr>
+                <w:rFonts w:hint="eastAsia" w:ascii="SimSun" w:hAnsi="SimSun" w:eastAsia="SimSun" w:cs="SimSun"/>
+                <w:color w:val="1f2328"/>
+                <w:sz w:val="21"/>
+              </w:rPr>
+              <w:t>M6 推送与互通</w:t>
+            </w:r>
+          </w:p>
+        </w:tc>
+        <w:tc>
+          <w:tcPr>
+            <w:tcW w:w="2768" w:type="dxa"/>
+            <w:tcBorders>
+              <w:top w:val="single" w:color="c8d3e0" w:sz="6"/>
+              <w:left w:val="single" w:color="c8d3e0" w:sz="6"/>
+              <w:bottom w:val="single" w:color="c8d3e0" w:sz="6"/>
+              <w:right w:val="single" w:color="c8d3e0" w:sz="6"/>
+            </w:tcBorders>
+            <w:shd w:val="clear" w:fill="f5f7fa"/>
+            <w:tcMar>
+              <w:top w:w="90" w:type="dxa"/>
+              <w:left w:w="135" w:type="dxa"/>
+              <w:bottom w:w="90" w:type="dxa"/>
+              <w:right w:w="135" w:type="dxa"/>
+            </w:tcMar>
+            <w:vAlign w:val="top"/>
+          </w:tcPr>
+          <w:p>
+            <w:pPr>
+              <w:rPr>
+                <w:color w:val="1f2328"/>
+              </w:rPr>
+            </w:pPr>
+            <w:r>
+              <w:rPr>
+                <w:rFonts w:hint="eastAsia" w:ascii="SimSun" w:hAnsi="SimSun" w:eastAsia="SimSun" w:cs="SimSun"/>
+                <w:color w:val="1f2328"/>
+                <w:sz w:val="21"/>
+              </w:rPr>
               <w:t>微信订阅消息后台推送、小程序与 Web 数据互通</w:t>
             </w:r>
           </w:p>
@@ -16215,6 +17470,7 @@
               <w:bottom w:val="single" w:color="c8d3e0" w:sz="6"/>
               <w:right w:val="single" w:color="c8d3e0" w:sz="6"/>
             </w:tcBorders>
+            <w:shd w:val="clear" w:fill="f5f7fa"/>
             <w:tcMar>
               <w:top w:w="90" w:type="dxa"/>
               <w:left w:w="135" w:type="dxa"/>
@@ -16372,7 +17628,7 @@
           <w:color w:val="1f2328"/>
           <w:sz w:val="24"/>
         </w:rPr>
-        <w:t>Web 侧：真实 Chrome 移动端视口全模块 42 项；搜索 14 项、日历详情 10 项、健壮性 10 项、导航按钮 7 项，全部通过。</w:t>
+        <w:t>Web 侧：真实 Chrome 移动端视口全模块 42 项；日历页 24 项、搜索 14 项、日历详情 10 项、健壮性 10 项、档案 16 项，全部通过。</w:t>
       </w:r>
     </w:p>
     <w:p>
@@ -16397,7 +17653,32 @@
           <w:color w:val="1f2328"/>
           <w:sz w:val="24"/>
         </w:rPr>
-        <w:t>合计 29 个测试脚本、350 条以上断言全部通过。</w:t>
+        <w:t>历法算法单测 45 项：农历（含闰月）、干支、生肖、节气、节日逐条比对权威万年历，全部通过。</w:t>
+      </w:r>
+    </w:p>
+    <w:p>
+      <w:pPr>
+        <w:numPr>
+          <w:ilvl w:val="0"/>
+          <w:numId w:val="1"/>
+        </w:numPr>
+        <w:pBdr>
+          <w:left w:space="22"/>
+        </w:pBdr>
+        <w:spacing w:before="90" w:after="75" w:line="432"/>
+        <w:ind w:left="90" w:right="90"/>
+        <w:jc w:val="both"/>
+        <w:rPr>
+          <w:color w:val="1f2328"/>
+        </w:rPr>
+      </w:pPr>
+      <w:r>
+        <w:rPr>
+          <w:rFonts w:hint="eastAsia" w:ascii="SimSun" w:hAnsi="SimSun" w:eastAsia="SimSun" w:cs="SimSun"/>
+          <w:color w:val="1f2328"/>
+          <w:sz w:val="24"/>
+        </w:rPr>
+        <w:t>合计 31 个测试脚本、470 条以上断言全部通过。</w:t>
       </w:r>
     </w:p>
     <w:p>
@@ -17011,6 +18292,146 @@
                 <w:sz w:val="21"/>
               </w:rPr>
               <w:t>我的 → 数据备份，可复制或导出 JSON</w:t>
+            </w:r>
+          </w:p>
+        </w:tc>
+      </w:tr>
+      <w:tr>
+        <w:trPr/>
+        <w:tc>
+          <w:tcPr>
+            <w:tcW w:w="4153" w:type="dxa"/>
+            <w:tcBorders>
+              <w:top w:val="single" w:color="c8d3e0" w:sz="6"/>
+              <w:left w:val="single" w:color="c8d3e0" w:sz="6"/>
+              <w:bottom w:val="single" w:color="c8d3e0" w:sz="6"/>
+              <w:right w:val="single" w:color="c8d3e0" w:sz="6"/>
+            </w:tcBorders>
+            <w:shd w:val="clear" w:fill="f5f7fa"/>
+            <w:tcMar>
+              <w:top w:w="90" w:type="dxa"/>
+              <w:left w:w="135" w:type="dxa"/>
+              <w:bottom w:w="90" w:type="dxa"/>
+              <w:right w:w="135" w:type="dxa"/>
+            </w:tcMar>
+            <w:vAlign w:val="top"/>
+          </w:tcPr>
+          <w:p>
+            <w:pPr>
+              <w:rPr>
+                <w:color w:val="1f2328"/>
+              </w:rPr>
+            </w:pPr>
+            <w:r>
+              <w:rPr>
+                <w:rFonts w:ascii="SimSun" w:hAnsi="SimSun" w:eastAsia="SimSun" w:cs="SimSun"/>
+                <w:color w:val="1f2328"/>
+                <w:sz w:val="21"/>
+              </w:rPr>
+              <w:t>8</w:t>
+            </w:r>
+          </w:p>
+        </w:tc>
+        <w:tc>
+          <w:tcPr>
+            <w:tcW w:w="4153" w:type="dxa"/>
+            <w:tcBorders>
+              <w:top w:val="single" w:color="c8d3e0" w:sz="6"/>
+              <w:left w:val="single" w:color="c8d3e0" w:sz="6"/>
+              <w:bottom w:val="single" w:color="c8d3e0" w:sz="6"/>
+              <w:right w:val="single" w:color="c8d3e0" w:sz="6"/>
+            </w:tcBorders>
+            <w:shd w:val="clear" w:fill="f5f7fa"/>
+            <w:tcMar>
+              <w:top w:w="90" w:type="dxa"/>
+              <w:left w:w="135" w:type="dxa"/>
+              <w:bottom w:w="90" w:type="dxa"/>
+              <w:right w:w="135" w:type="dxa"/>
+            </w:tcMar>
+            <w:vAlign w:val="top"/>
+          </w:tcPr>
+          <w:p>
+            <w:pPr>
+              <w:rPr>
+                <w:color w:val="1f2328"/>
+              </w:rPr>
+            </w:pPr>
+            <w:r>
+              <w:rPr>
+                <w:rFonts w:hint="eastAsia" w:ascii="SimSun" w:hAnsi="SimSun" w:eastAsia="SimSun" w:cs="SimSun"/>
+                <w:color w:val="1f2328"/>
+                <w:sz w:val="21"/>
+              </w:rPr>
+              <w:t>日历页：农历小字显示正确，今日高亮，翻月正常，点某天能弹出当天记录</w:t>
+            </w:r>
+          </w:p>
+        </w:tc>
+      </w:tr>
+      <w:tr>
+        <w:trPr/>
+        <w:tc>
+          <w:tcPr>
+            <w:tcW w:w="4153" w:type="dxa"/>
+            <w:tcBorders>
+              <w:top w:val="single" w:color="c8d3e0" w:sz="6"/>
+              <w:left w:val="single" w:color="c8d3e0" w:sz="6"/>
+              <w:bottom w:val="single" w:color="c8d3e0" w:sz="6"/>
+              <w:right w:val="single" w:color="c8d3e0" w:sz="6"/>
+            </w:tcBorders>
+            <w:tcMar>
+              <w:top w:w="90" w:type="dxa"/>
+              <w:left w:w="135" w:type="dxa"/>
+              <w:bottom w:w="90" w:type="dxa"/>
+              <w:right w:w="135" w:type="dxa"/>
+            </w:tcMar>
+            <w:vAlign w:val="top"/>
+          </w:tcPr>
+          <w:p>
+            <w:pPr>
+              <w:rPr>
+                <w:color w:val="1f2328"/>
+              </w:rPr>
+            </w:pPr>
+            <w:r>
+              <w:rPr>
+                <w:rFonts w:ascii="SimSun" w:hAnsi="SimSun" w:eastAsia="SimSun" w:cs="SimSun"/>
+                <w:color w:val="1f2328"/>
+                <w:sz w:val="21"/>
+              </w:rPr>
+              <w:t>9</w:t>
+            </w:r>
+          </w:p>
+        </w:tc>
+        <w:tc>
+          <w:tcPr>
+            <w:tcW w:w="4153" w:type="dxa"/>
+            <w:tcBorders>
+              <w:top w:val="single" w:color="c8d3e0" w:sz="6"/>
+              <w:left w:val="single" w:color="c8d3e0" w:sz="6"/>
+              <w:bottom w:val="single" w:color="c8d3e0" w:sz="6"/>
+              <w:right w:val="single" w:color="c8d3e0" w:sz="6"/>
+            </w:tcBorders>
+            <w:tcMar>
+              <w:top w:w="90" w:type="dxa"/>
+              <w:left w:w="135" w:type="dxa"/>
+              <w:bottom w:w="90" w:type="dxa"/>
+              <w:right w:w="135" w:type="dxa"/>
+            </w:tcMar>
+            <w:vAlign w:val="top"/>
+          </w:tcPr>
+          <w:p>
+            <w:pPr>
+              <w:rPr>
+                <w:color w:val="1f2328"/>
+              </w:rPr>
+            </w:pPr>
+            <w:r>
+              <w:rPr>
+                <w:rFonts w:hint="eastAsia" w:ascii="SimSun" w:hAnsi="SimSun" w:eastAsia="SimSun" w:cs="SimSun"/>
+                <w:color w:val="1f2328"/>
+                <w:sz w:val="21"/>
+              </w:rPr>
+              <w:t>我的 → 「添加到桌面 / 主屏幕」：手机可加到主屏，电脑可安装为桌面应用</w:t>
             </w:r>
           </w:p>
         </w:tc>
@@ -17693,7 +19114,214 @@
                 <w:color w:val="1f2328"/>
                 <w:sz w:val="21"/>
               </w:rPr>
-              <w:t>已在页面标注，完整体验在小程序端</w:t>
+              <w:t>已在页面标注，完整体验见小程序端历史版本</w:t>
+            </w:r>
+          </w:p>
+        </w:tc>
+      </w:tr>
+      <w:tr>
+        <w:trPr/>
+        <w:tc>
+          <w:tcPr>
+            <w:tcW w:w="2768" w:type="dxa"/>
+            <w:tcBorders>
+              <w:top w:val="single" w:color="c8d3e0" w:sz="6"/>
+              <w:left w:val="single" w:color="c8d3e0" w:sz="6"/>
+              <w:bottom w:val="single" w:color="c8d3e0" w:sz="6"/>
+              <w:right w:val="single" w:color="c8d3e0" w:sz="6"/>
+            </w:tcBorders>
+            <w:shd w:val="clear" w:fill="f5f7fa"/>
+            <w:tcMar>
+              <w:top w:w="90" w:type="dxa"/>
+              <w:left w:w="135" w:type="dxa"/>
+              <w:bottom w:w="90" w:type="dxa"/>
+              <w:right w:w="135" w:type="dxa"/>
+            </w:tcMar>
+            <w:vAlign w:val="top"/>
+          </w:tcPr>
+          <w:p>
+            <w:pPr>
+              <w:rPr>
+                <w:color w:val="1f2328"/>
+              </w:rPr>
+            </w:pPr>
+            <w:r>
+              <w:rPr>
+                <w:rFonts w:hint="eastAsia" w:ascii="SimSun" w:hAnsi="SimSun" w:eastAsia="SimSun" w:cs="SimSun"/>
+                <w:color w:val="1f2328"/>
+                <w:sz w:val="21"/>
+              </w:rPr>
+              <w:t>小程序停止迭代</w:t>
+            </w:r>
+          </w:p>
+        </w:tc>
+        <w:tc>
+          <w:tcPr>
+            <w:tcW w:w="2768" w:type="dxa"/>
+            <w:tcBorders>
+              <w:top w:val="single" w:color="c8d3e0" w:sz="6"/>
+              <w:left w:val="single" w:color="c8d3e0" w:sz="6"/>
+              <w:bottom w:val="single" w:color="c8d3e0" w:sz="6"/>
+              <w:right w:val="single" w:color="c8d3e0" w:sz="6"/>
+            </w:tcBorders>
+            <w:shd w:val="clear" w:fill="f5f7fa"/>
+            <w:tcMar>
+              <w:top w:w="90" w:type="dxa"/>
+              <w:left w:w="135" w:type="dxa"/>
+              <w:bottom w:w="90" w:type="dxa"/>
+              <w:right w:w="135" w:type="dxa"/>
+            </w:tcMar>
+            <w:vAlign w:val="top"/>
+          </w:tcPr>
+          <w:p>
+            <w:pPr>
+              <w:rPr>
+                <w:color w:val="1f2328"/>
+              </w:rPr>
+            </w:pPr>
+            <w:r>
+              <w:rPr>
+                <w:rFonts w:hint="eastAsia" w:ascii="SimSun" w:hAnsi="SimSun" w:eastAsia="SimSun" w:cs="SimSun"/>
+                <w:color w:val="1f2328"/>
+                <w:sz w:val="21"/>
+              </w:rPr>
+              <w:t>老用户换端需重新录入</w:t>
+            </w:r>
+          </w:p>
+        </w:tc>
+        <w:tc>
+          <w:tcPr>
+            <w:tcW w:w="2768" w:type="dxa"/>
+            <w:tcBorders>
+              <w:top w:val="single" w:color="c8d3e0" w:sz="6"/>
+              <w:left w:val="single" w:color="c8d3e0" w:sz="6"/>
+              <w:bottom w:val="single" w:color="c8d3e0" w:sz="6"/>
+              <w:right w:val="single" w:color="c8d3e0" w:sz="6"/>
+            </w:tcBorders>
+            <w:shd w:val="clear" w:fill="f5f7fa"/>
+            <w:tcMar>
+              <w:top w:w="90" w:type="dxa"/>
+              <w:left w:w="135" w:type="dxa"/>
+              <w:bottom w:w="90" w:type="dxa"/>
+              <w:right w:w="135" w:type="dxa"/>
+            </w:tcMar>
+            <w:vAlign w:val="top"/>
+          </w:tcPr>
+          <w:p>
+            <w:pPr>
+              <w:rPr>
+                <w:color w:val="1f2328"/>
+              </w:rPr>
+            </w:pPr>
+            <w:r>
+              <w:rPr>
+                <w:rFonts w:hint="eastAsia" w:ascii="SimSun" w:hAnsi="SimSun" w:eastAsia="SimSun" w:cs="SimSun"/>
+                <w:color w:val="1f2328"/>
+                <w:sz w:val="21"/>
+              </w:rPr>
+              <w:t>提供备份 JSON 导入导出；新功能统一在 Web / PWA 端</w:t>
+            </w:r>
+          </w:p>
+        </w:tc>
+      </w:tr>
+      <w:tr>
+        <w:trPr/>
+        <w:tc>
+          <w:tcPr>
+            <w:tcW w:w="2768" w:type="dxa"/>
+            <w:tcBorders>
+              <w:top w:val="single" w:color="c8d3e0" w:sz="6"/>
+              <w:left w:val="single" w:color="c8d3e0" w:sz="6"/>
+              <w:bottom w:val="single" w:color="c8d3e0" w:sz="6"/>
+              <w:right w:val="single" w:color="c8d3e0" w:sz="6"/>
+            </w:tcBorders>
+            <w:tcMar>
+              <w:top w:w="90" w:type="dxa"/>
+              <w:left w:w="135" w:type="dxa"/>
+              <w:bottom w:w="90" w:type="dxa"/>
+              <w:right w:w="135" w:type="dxa"/>
+            </w:tcMar>
+            <w:vAlign w:val="top"/>
+          </w:tcPr>
+          <w:p>
+            <w:pPr>
+              <w:rPr>
+                <w:color w:val="1f2328"/>
+              </w:rPr>
+            </w:pPr>
+            <w:r>
+              <w:rPr>
+                <w:rFonts w:hint="eastAsia" w:ascii="SimSun" w:hAnsi="SimSun" w:eastAsia="SimSun" w:cs="SimSun"/>
+                <w:color w:val="1f2328"/>
+                <w:sz w:val="21"/>
+              </w:rPr>
+              <w:t>历法算法维护</w:t>
+            </w:r>
+          </w:p>
+        </w:tc>
+        <w:tc>
+          <w:tcPr>
+            <w:tcW w:w="2768" w:type="dxa"/>
+            <w:tcBorders>
+              <w:top w:val="single" w:color="c8d3e0" w:sz="6"/>
+              <w:left w:val="single" w:color="c8d3e0" w:sz="6"/>
+              <w:bottom w:val="single" w:color="c8d3e0" w:sz="6"/>
+              <w:right w:val="single" w:color="c8d3e0" w:sz="6"/>
+            </w:tcBorders>
+            <w:tcMar>
+              <w:top w:w="90" w:type="dxa"/>
+              <w:left w:w="135" w:type="dxa"/>
+              <w:bottom w:w="90" w:type="dxa"/>
+              <w:right w:w="135" w:type="dxa"/>
+            </w:tcMar>
+            <w:vAlign w:val="top"/>
+          </w:tcPr>
+          <w:p>
+            <w:pPr>
+              <w:rPr>
+                <w:color w:val="1f2328"/>
+              </w:rPr>
+            </w:pPr>
+            <w:r>
+              <w:rPr>
+                <w:rFonts w:hint="eastAsia" w:ascii="SimSun" w:hAnsi="SimSun" w:eastAsia="SimSun" w:cs="SimSun"/>
+                <w:color w:val="1f2328"/>
+                <w:sz w:val="21"/>
+              </w:rPr>
+              <w:t>农历表覆盖至 2100 年，之后需扩展</w:t>
+            </w:r>
+          </w:p>
+        </w:tc>
+        <w:tc>
+          <w:tcPr>
+            <w:tcW w:w="2768" w:type="dxa"/>
+            <w:tcBorders>
+              <w:top w:val="single" w:color="c8d3e0" w:sz="6"/>
+              <w:left w:val="single" w:color="c8d3e0" w:sz="6"/>
+              <w:bottom w:val="single" w:color="c8d3e0" w:sz="6"/>
+              <w:right w:val="single" w:color="c8d3e0" w:sz="6"/>
+            </w:tcBorders>
+            <w:tcMar>
+              <w:top w:w="90" w:type="dxa"/>
+              <w:left w:w="135" w:type="dxa"/>
+              <w:bottom w:w="90" w:type="dxa"/>
+              <w:right w:w="135" w:type="dxa"/>
+            </w:tcMar>
+            <w:vAlign w:val="top"/>
+          </w:tcPr>
+          <w:p>
+            <w:pPr>
+              <w:rPr>
+                <w:color w:val="1f2328"/>
+              </w:rPr>
+            </w:pPr>
+            <w:r>
+              <w:rPr>
+                <w:rFonts w:hint="eastAsia" w:ascii="SimSun" w:hAnsi="SimSun" w:eastAsia="SimSun" w:cs="SimSun"/>
+                <w:color w:val="1f2328"/>
+                <w:sz w:val="21"/>
+              </w:rPr>
+              <w:t>已单测锁定边界（1900 与 2100 年返回安全值），到期前扩展年表即可</w:t>
             </w:r>
           </w:p>
         </w:tc>
@@ -18232,6 +19860,216 @@
             </w:pPr>
             <w:r>
               <w:rPr>
+                <w:rFonts w:hint="eastAsia" w:ascii="SimSun" w:hAnsi="SimSun" w:eastAsia="SimSun" w:cs="SimSun"/>
+                <w:color w:val="1f2328"/>
+                <w:sz w:val="21"/>
+              </w:rPr>
+              <w:t>农历（阴历）</w:t>
+            </w:r>
+          </w:p>
+        </w:tc>
+        <w:tc>
+          <w:tcPr>
+            <w:tcW w:w="4153" w:type="dxa"/>
+            <w:tcBorders>
+              <w:top w:val="single" w:color="c8d3e0" w:sz="6"/>
+              <w:left w:val="single" w:color="c8d3e0" w:sz="6"/>
+              <w:bottom w:val="single" w:color="c8d3e0" w:sz="6"/>
+              <w:right w:val="single" w:color="c8d3e0" w:sz="6"/>
+            </w:tcBorders>
+            <w:shd w:val="clear" w:fill="f5f7fa"/>
+            <w:tcMar>
+              <w:top w:w="90" w:type="dxa"/>
+              <w:left w:w="135" w:type="dxa"/>
+              <w:bottom w:w="90" w:type="dxa"/>
+              <w:right w:w="135" w:type="dxa"/>
+            </w:tcMar>
+            <w:vAlign w:val="top"/>
+          </w:tcPr>
+          <w:p>
+            <w:pPr>
+              <w:rPr>
+                <w:color w:val="1f2328"/>
+              </w:rPr>
+            </w:pPr>
+            <w:r>
+              <w:rPr>
+                <w:rFonts w:hint="eastAsia" w:ascii="SimSun" w:hAnsi="SimSun" w:eastAsia="SimSun" w:cs="SimSun"/>
+                <w:color w:val="1f2328"/>
+                <w:sz w:val="21"/>
+              </w:rPr>
+              <w:t>以月相周期纪日的传统历法，本项目覆盖 1900 至 2100 年，含闰月</w:t>
+            </w:r>
+          </w:p>
+        </w:tc>
+      </w:tr>
+      <w:tr>
+        <w:trPr/>
+        <w:tc>
+          <w:tcPr>
+            <w:tcW w:w="4153" w:type="dxa"/>
+            <w:tcBorders>
+              <w:top w:val="single" w:color="c8d3e0" w:sz="6"/>
+              <w:left w:val="single" w:color="c8d3e0" w:sz="6"/>
+              <w:bottom w:val="single" w:color="c8d3e0" w:sz="6"/>
+              <w:right w:val="single" w:color="c8d3e0" w:sz="6"/>
+            </w:tcBorders>
+            <w:tcMar>
+              <w:top w:w="90" w:type="dxa"/>
+              <w:left w:w="135" w:type="dxa"/>
+              <w:bottom w:w="90" w:type="dxa"/>
+              <w:right w:w="135" w:type="dxa"/>
+            </w:tcMar>
+            <w:vAlign w:val="top"/>
+          </w:tcPr>
+          <w:p>
+            <w:pPr>
+              <w:rPr>
+                <w:color w:val="1f2328"/>
+              </w:rPr>
+            </w:pPr>
+            <w:r>
+              <w:rPr>
+                <w:rFonts w:hint="eastAsia" w:ascii="SimSun" w:hAnsi="SimSun" w:eastAsia="SimSun" w:cs="SimSun"/>
+                <w:color w:val="1f2328"/>
+                <w:sz w:val="21"/>
+              </w:rPr>
+              <w:t>节气</w:t>
+            </w:r>
+          </w:p>
+        </w:tc>
+        <w:tc>
+          <w:tcPr>
+            <w:tcW w:w="4153" w:type="dxa"/>
+            <w:tcBorders>
+              <w:top w:val="single" w:color="c8d3e0" w:sz="6"/>
+              <w:left w:val="single" w:color="c8d3e0" w:sz="6"/>
+              <w:bottom w:val="single" w:color="c8d3e0" w:sz="6"/>
+              <w:right w:val="single" w:color="c8d3e0" w:sz="6"/>
+            </w:tcBorders>
+            <w:tcMar>
+              <w:top w:w="90" w:type="dxa"/>
+              <w:left w:w="135" w:type="dxa"/>
+              <w:bottom w:w="90" w:type="dxa"/>
+              <w:right w:w="135" w:type="dxa"/>
+            </w:tcMar>
+            <w:vAlign w:val="top"/>
+          </w:tcPr>
+          <w:p>
+            <w:pPr>
+              <w:rPr>
+                <w:color w:val="1f2328"/>
+              </w:rPr>
+            </w:pPr>
+            <w:r>
+              <w:rPr>
+                <w:rFonts w:hint="eastAsia" w:ascii="SimSun" w:hAnsi="SimSun" w:eastAsia="SimSun" w:cs="SimSun"/>
+                <w:color w:val="1f2328"/>
+                <w:sz w:val="21"/>
+              </w:rPr>
+              <w:t>按太阳视黄经每 15 度划分的二十四个时间点，如立春、清明、冬至</w:t>
+            </w:r>
+          </w:p>
+        </w:tc>
+      </w:tr>
+      <w:tr>
+        <w:trPr/>
+        <w:tc>
+          <w:tcPr>
+            <w:tcW w:w="4153" w:type="dxa"/>
+            <w:tcBorders>
+              <w:top w:val="single" w:color="c8d3e0" w:sz="6"/>
+              <w:left w:val="single" w:color="c8d3e0" w:sz="6"/>
+              <w:bottom w:val="single" w:color="c8d3e0" w:sz="6"/>
+              <w:right w:val="single" w:color="c8d3e0" w:sz="6"/>
+            </w:tcBorders>
+            <w:shd w:val="clear" w:fill="f5f7fa"/>
+            <w:tcMar>
+              <w:top w:w="90" w:type="dxa"/>
+              <w:left w:w="135" w:type="dxa"/>
+              <w:bottom w:w="90" w:type="dxa"/>
+              <w:right w:w="135" w:type="dxa"/>
+            </w:tcMar>
+            <w:vAlign w:val="top"/>
+          </w:tcPr>
+          <w:p>
+            <w:pPr>
+              <w:rPr>
+                <w:color w:val="1f2328"/>
+              </w:rPr>
+            </w:pPr>
+            <w:r>
+              <w:rPr>
+                <w:rFonts w:hint="eastAsia" w:ascii="SimSun" w:hAnsi="SimSun" w:eastAsia="SimSun" w:cs="SimSun"/>
+                <w:color w:val="1f2328"/>
+                <w:sz w:val="21"/>
+              </w:rPr>
+              <w:t>干支</w:t>
+            </w:r>
+          </w:p>
+        </w:tc>
+        <w:tc>
+          <w:tcPr>
+            <w:tcW w:w="4153" w:type="dxa"/>
+            <w:tcBorders>
+              <w:top w:val="single" w:color="c8d3e0" w:sz="6"/>
+              <w:left w:val="single" w:color="c8d3e0" w:sz="6"/>
+              <w:bottom w:val="single" w:color="c8d3e0" w:sz="6"/>
+              <w:right w:val="single" w:color="c8d3e0" w:sz="6"/>
+            </w:tcBorders>
+            <w:shd w:val="clear" w:fill="f5f7fa"/>
+            <w:tcMar>
+              <w:top w:w="90" w:type="dxa"/>
+              <w:left w:w="135" w:type="dxa"/>
+              <w:bottom w:w="90" w:type="dxa"/>
+              <w:right w:w="135" w:type="dxa"/>
+            </w:tcMar>
+            <w:vAlign w:val="top"/>
+          </w:tcPr>
+          <w:p>
+            <w:pPr>
+              <w:rPr>
+                <w:color w:val="1f2328"/>
+              </w:rPr>
+            </w:pPr>
+            <w:r>
+              <w:rPr>
+                <w:rFonts w:hint="eastAsia" w:ascii="SimSun" w:hAnsi="SimSun" w:eastAsia="SimSun" w:cs="SimSun"/>
+                <w:color w:val="1f2328"/>
+                <w:sz w:val="21"/>
+              </w:rPr>
+              <w:t>天干地支纪年，本项目随农历年显示，如丙午年（马年）</w:t>
+            </w:r>
+          </w:p>
+        </w:tc>
+      </w:tr>
+      <w:tr>
+        <w:trPr/>
+        <w:tc>
+          <w:tcPr>
+            <w:tcW w:w="4153" w:type="dxa"/>
+            <w:tcBorders>
+              <w:top w:val="single" w:color="c8d3e0" w:sz="6"/>
+              <w:left w:val="single" w:color="c8d3e0" w:sz="6"/>
+              <w:bottom w:val="single" w:color="c8d3e0" w:sz="6"/>
+              <w:right w:val="single" w:color="c8d3e0" w:sz="6"/>
+            </w:tcBorders>
+            <w:tcMar>
+              <w:top w:w="90" w:type="dxa"/>
+              <w:left w:w="135" w:type="dxa"/>
+              <w:bottom w:w="90" w:type="dxa"/>
+              <w:right w:w="135" w:type="dxa"/>
+            </w:tcMar>
+            <w:vAlign w:val="top"/>
+          </w:tcPr>
+          <w:p>
+            <w:pPr>
+              <w:rPr>
+                <w:color w:val="1f2328"/>
+              </w:rPr>
+            </w:pPr>
+            <w:r>
+              <w:rPr>
                 <w:rFonts w:ascii="SimSun" w:hAnsi="SimSun" w:eastAsia="SimSun" w:cs="SimSun"/>
                 <w:color w:val="1f2328"/>
                 <w:sz w:val="21"/>
@@ -18249,7 +20087,6 @@
               <w:bottom w:val="single" w:color="c8d3e0" w:sz="6"/>
               <w:right w:val="single" w:color="c8d3e0" w:sz="6"/>
             </w:tcBorders>
-            <w:shd w:val="clear" w:fill="f5f7fa"/>
             <w:tcMar>
               <w:top w:w="90" w:type="dxa"/>
               <w:left w:w="135" w:type="dxa"/>
@@ -18438,7 +20275,7 @@
         <w:color w:val="888888"/>
         <w:sz w:val="18"/>
       </w:rPr>
-      <w:t xml:space="preserve">小宝工作台 v1.0 · 2026-10-21第 </w:t>
+      <w:t xml:space="preserve">小宝工作台 v1.1 · 2026-10-21第 </w:t>
     </w:r>
     <w:r>
       <w:fldChar w:fldCharType="begin"/>
@@ -18492,17 +20329,6 @@
   <w:abstractNum w:abstractNumId="0">
     <w:lvl w:ilvl="0">
       <w:start w:val="1"/>
-      <w:numFmt w:val="decimal"/>
-      <w:lvlText w:val="%1."/>
-      <w:lvlJc w:val="left"/>
-      <w:pPr>
-        <w:ind w:left="420" w:hanging="420"/>
-      </w:pPr>
-    </w:lvl>
-  </w:abstractNum>
-  <w:abstractNum w:abstractNumId="1">
-    <w:lvl w:ilvl="0">
-      <w:start w:val="1"/>
       <w:numFmt w:val="bullet"/>
       <w:lvlText w:val=""/>
       <w:lvlJc w:val="left"/>
@@ -18514,11 +20340,22 @@
       </w:rPr>
     </w:lvl>
   </w:abstractNum>
+  <w:abstractNum w:abstractNumId="1">
+    <w:lvl w:ilvl="0">
+      <w:start w:val="1"/>
+      <w:numFmt w:val="decimal"/>
+      <w:lvlText w:val="%1."/>
+      <w:lvlJc w:val="left"/>
+      <w:pPr>
+        <w:ind w:left="420" w:hanging="420"/>
+      </w:pPr>
+    </w:lvl>
+  </w:abstractNum>
   <w:num w:numId="1">
-    <w:abstractNumId w:val="1"/>
+    <w:abstractNumId w:val="0"/>
   </w:num>
   <w:num w:numId="2">
-    <w:abstractNumId w:val="0"/>
+    <w:abstractNumId w:val="1"/>
   </w:num>
 </w:numbering>
 </file>
@@ -18543,112 +20380,94 @@
   </w:docDefaults>
   <w:latentStyles w:defLockedState="0" w:defUIPriority="99" w:defSemiHidden="0" w:defUnhideWhenUsed="0" w:defQFormat="0" w:count="88">
     <w:lsdException w:name="List Number 3" w:semiHidden="1" w:unhideWhenUsed="1"/>
-    <w:lsdException w:name="table of authorities" w:semiHidden="1" w:unhideWhenUsed="1"/>
-    <w:lsdException w:name="List Number 5" w:semiHidden="1" w:unhideWhenUsed="1"/>
-    <w:lsdException w:name="List Bullet 3" w:semiHidden="1" w:unhideWhenUsed="1"/>
-    <w:lsdException w:name="Body Text Indent 2" w:semiHidden="1" w:unhideWhenUsed="1"/>
-    <w:lsdException w:name="index heading" w:semiHidden="1" w:unhideWhenUsed="1"/>
-    <w:lsdException w:name="heading 9" w:uiPriority="9" w:semiHidden="1" w:unhideWhenUsed="1" w:qFormat="1"/>
-    <w:lsdException w:name="Default Paragraph Font" w:uiPriority="1" w:semiHidden="1" w:unhideWhenUsed="1"/>
-    <w:lsdException w:name="toc 2" w:uiPriority="39" w:semiHidden="1" w:unhideWhenUsed="1"/>
-    <w:lsdException w:name="index 2" w:semiHidden="1" w:unhideWhenUsed="1"/>
-    <w:lsdException w:name="line number" w:semiHidden="1" w:unhideWhenUsed="1"/>
+    <w:lsdException w:name="page number" w:semiHidden="1" w:unhideWhenUsed="1"/>
     <w:lsdException w:name="index 6" w:semiHidden="1" w:unhideWhenUsed="1"/>
+    <w:lsdException w:name="index 4" w:semiHidden="1" w:unhideWhenUsed="1"/>
+    <w:lsdException w:name="FollowedHyperlink" w:semiHidden="1" w:unhideWhenUsed="1"/>
+    <w:lsdException w:name="List Number" w:semiHidden="1" w:unhideWhenUsed="1"/>
+    <w:lsdException w:name="toc 6" w:uiPriority="39" w:semiHidden="1" w:unhideWhenUsed="1"/>
+    <w:lsdException w:name="index 7" w:semiHidden="1" w:unhideWhenUsed="1"/>
+    <w:lsdException w:name="Message Header" w:semiHidden="1" w:unhideWhenUsed="1"/>
+    <w:lsdException w:name="heading 7" w:uiPriority="9" w:semiHidden="1" w:unhideWhenUsed="1" w:qFormat="1"/>
+    <w:lsdException w:name="table of figures" w:semiHidden="1" w:unhideWhenUsed="1"/>
+    <w:lsdException w:name="Block Text" w:semiHidden="1" w:unhideWhenUsed="1"/>
+    <w:lsdException w:name="List Continue" w:semiHidden="1" w:unhideWhenUsed="1"/>
+    <w:lsdException w:name="toc 1" w:uiPriority="39" w:semiHidden="1" w:unhideWhenUsed="1"/>
+    <w:lsdException w:name="toc 7" w:uiPriority="39" w:semiHidden="1" w:unhideWhenUsed="1"/>
     <w:lsdException w:name="Body Text Indent" w:semiHidden="1" w:unhideWhenUsed="1"/>
-    <w:lsdException w:name="Message Header" w:semiHidden="1" w:unhideWhenUsed="1"/>
-    <w:lsdException w:name="table of figures" w:semiHidden="1" w:unhideWhenUsed="1"/>
-    <w:lsdException w:name="heading 8" w:uiPriority="9" w:semiHidden="1" w:unhideWhenUsed="1" w:qFormat="1"/>
-    <w:lsdException w:name="Closing" w:semiHidden="1" w:unhideWhenUsed="1"/>
-    <w:lsdException w:name="index 9" w:semiHidden="1" w:unhideWhenUsed="1"/>
-    <w:lsdException w:name="index 3" w:semiHidden="1" w:unhideWhenUsed="1"/>
+    <w:lsdException w:name="Note Heading" w:semiHidden="1" w:unhideWhenUsed="1"/>
     <w:lsdException w:name="List 2" w:semiHidden="1" w:unhideWhenUsed="1"/>
     <w:lsdException w:name="Subtitle" w:uiPriority="11" w:qFormat="1"/>
     <w:lsdException w:name="Body Text 2" w:semiHidden="1" w:unhideWhenUsed="1"/>
-    <w:lsdException w:name="List Continue 2" w:semiHidden="1" w:unhideWhenUsed="1"/>
-    <w:lsdException w:name="heading 3" w:uiPriority="9" w:semiHidden="1" w:unhideWhenUsed="1" w:qFormat="1"/>
-    <w:lsdException w:name="Block Text" w:semiHidden="1" w:unhideWhenUsed="1"/>
-    <w:lsdException w:name="heading 6" w:uiPriority="9" w:semiHidden="1" w:unhideWhenUsed="1" w:qFormat="1"/>
-    <w:lsdException w:name="index 8" w:semiHidden="1" w:unhideWhenUsed="1"/>
-    <w:lsdException w:name="toc 5" w:uiPriority="39" w:semiHidden="1" w:unhideWhenUsed="1"/>
-    <w:lsdException w:name="FollowedHyperlink" w:semiHidden="1" w:unhideWhenUsed="1"/>
-    <w:lsdException w:name="List Bullet 2" w:semiHidden="1" w:unhideWhenUsed="1"/>
-    <w:lsdException w:name="List 5" w:semiHidden="1" w:unhideWhenUsed="1"/>
+    <w:lsdException w:name="Default Paragraph Font" w:uiPriority="1" w:semiHidden="1" w:unhideWhenUsed="1"/>
+    <w:lsdException w:name="footnote reference" w:semiHidden="1" w:unhideWhenUsed="1"/>
+    <w:lsdException w:name="List 4" w:semiHidden="1" w:unhideWhenUsed="1"/>
     <w:lsdException w:name="List Number 2" w:semiHidden="1" w:unhideWhenUsed="1"/>
-    <w:lsdException w:name="toa heading" w:semiHidden="1" w:unhideWhenUsed="1"/>
-    <w:lsdException w:name="footnote reference" w:semiHidden="1" w:unhideWhenUsed="1"/>
-    <w:lsdException w:name="endnote reference" w:semiHidden="1" w:unhideWhenUsed="1"/>
-    <w:lsdException w:name="Normal Indent" w:semiHidden="1" w:unhideWhenUsed="1"/>
-    <w:lsdException w:name="heading 1" w:uiPriority="9" w:qFormat="1"/>
-    <w:lsdException w:name="heading 2" w:uiPriority="9" w:semiHidden="1" w:unhideWhenUsed="1" w:qFormat="1"/>
-    <w:lsdException w:name="index 5" w:semiHidden="1" w:unhideWhenUsed="1"/>
-    <w:lsdException w:name="toc 7" w:uiPriority="39" w:semiHidden="1" w:unhideWhenUsed="1"/>
-    <w:lsdException w:name="List" w:semiHidden="1" w:unhideWhenUsed="1"/>
-    <w:lsdException w:name="Body Text First Indent" w:semiHidden="1" w:unhideWhenUsed="1"/>
-    <w:lsdException w:name="envelope return" w:semiHidden="1" w:unhideWhenUsed="1"/>
-    <w:lsdException w:name="caption" w:uiPriority="35" w:semiHidden="1" w:unhideWhenUsed="1" w:qFormat="1"/>
-    <w:lsdException w:name="Strong" w:uiPriority="22" w:qFormat="1"/>
-    <w:lsdException w:name="toc 6" w:uiPriority="39" w:semiHidden="1" w:unhideWhenUsed="1"/>
-    <w:lsdException w:name="index 4" w:semiHidden="1" w:unhideWhenUsed="1"/>
-    <w:lsdException w:name="List 4" w:semiHidden="1" w:unhideWhenUsed="1"/>
-    <w:lsdException w:name="List Continue" w:semiHidden="1" w:unhideWhenUsed="1"/>
-    <w:lsdException w:name="header" w:semiHidden="1" w:unhideWhenUsed="1"/>
-    <w:lsdException w:name="Signature" w:semiHidden="1" w:unhideWhenUsed="1"/>
-    <w:lsdException w:name="List Continue 4" w:semiHidden="1" w:unhideWhenUsed="1"/>
-    <w:lsdException w:name="toc 1" w:uiPriority="39" w:semiHidden="1" w:unhideWhenUsed="1"/>
-    <w:lsdException w:name="heading 5" w:uiPriority="9" w:semiHidden="1" w:unhideWhenUsed="1" w:qFormat="1"/>
     <w:lsdException w:name="Body Text First Indent 2" w:semiHidden="1" w:unhideWhenUsed="1"/>
     <w:lsdException w:name="footer" w:semiHidden="1" w:unhideWhenUsed="1"/>
+    <w:lsdException w:name="index 1" w:semiHidden="1" w:unhideWhenUsed="1"/>
+    <w:lsdException w:name="index 5" w:semiHidden="1" w:unhideWhenUsed="1"/>
+    <w:lsdException w:name="Salutation" w:semiHidden="1" w:unhideWhenUsed="1"/>
+    <w:lsdException w:name="macro" w:semiHidden="1" w:unhideWhenUsed="1"/>
+    <w:lsdException w:name="List 5" w:semiHidden="1" w:unhideWhenUsed="1"/>
+    <w:lsdException w:name="table of authorities" w:semiHidden="1" w:unhideWhenUsed="1"/>
+    <w:lsdException w:name="heading 8" w:uiPriority="9" w:semiHidden="1" w:unhideWhenUsed="1" w:qFormat="1"/>
+    <w:lsdException w:name="endnote text" w:semiHidden="1" w:unhideWhenUsed="1"/>
+    <w:lsdException w:name="header" w:semiHidden="1" w:unhideWhenUsed="1"/>
+    <w:lsdException w:name="envelope return" w:semiHidden="1" w:unhideWhenUsed="1"/>
+    <w:lsdException w:name="heading 2" w:uiPriority="9" w:semiHidden="1" w:unhideWhenUsed="1" w:qFormat="1"/>
+    <w:lsdException w:name="List Number 5" w:semiHidden="1" w:unhideWhenUsed="1"/>
+    <w:lsdException w:name="index 8" w:semiHidden="1" w:unhideWhenUsed="1"/>
+    <w:lsdException w:name="Body Text 3" w:semiHidden="1" w:unhideWhenUsed="1"/>
+    <w:lsdException w:name="index 2" w:semiHidden="1" w:unhideWhenUsed="1"/>
+    <w:lsdException w:name="List Bullet 4" w:semiHidden="1" w:unhideWhenUsed="1"/>
+    <w:lsdException w:name="List Continue 3" w:semiHidden="1" w:unhideWhenUsed="1"/>
+    <w:lsdException w:name="heading 3" w:uiPriority="9" w:semiHidden="1" w:unhideWhenUsed="1" w:qFormat="1"/>
+    <w:lsdException w:name="toc 2" w:uiPriority="39" w:semiHidden="1" w:unhideWhenUsed="1"/>
+    <w:lsdException w:name="Normal Indent" w:semiHidden="1" w:unhideWhenUsed="1"/>
+    <w:lsdException w:name="index 9" w:semiHidden="1" w:unhideWhenUsed="1"/>
     <w:lsdException w:name="List Bullet 5" w:semiHidden="1" w:unhideWhenUsed="1"/>
+    <w:lsdException w:name="Body Text First Indent" w:semiHidden="1" w:unhideWhenUsed="1"/>
+    <w:lsdException w:name="Closing" w:semiHidden="1" w:unhideWhenUsed="1"/>
+    <w:lsdException w:name="List Bullet" w:semiHidden="1" w:unhideWhenUsed="1"/>
     <w:lsdException w:name="List 3" w:semiHidden="1" w:unhideWhenUsed="1"/>
-    <w:lsdException w:name="Body Text 3" w:semiHidden="1" w:unhideWhenUsed="1"/>
+    <w:lsdException w:name="footnote text" w:semiHidden="1" w:unhideWhenUsed="1"/>
+    <w:lsdException w:name="List" w:semiHidden="1" w:unhideWhenUsed="1"/>
+    <w:lsdException w:name="endnote reference" w:semiHidden="1" w:unhideWhenUsed="1"/>
+    <w:lsdException w:name="Body Text Indent 3" w:semiHidden="1" w:unhideWhenUsed="1"/>
+    <w:lsdException w:name="toc 8" w:uiPriority="39" w:semiHidden="1" w:unhideWhenUsed="1"/>
+    <w:lsdException w:name="heading 5" w:uiPriority="9" w:semiHidden="1" w:unhideWhenUsed="1" w:qFormat="1"/>
+    <w:lsdException w:name="Body Text Indent 2" w:semiHidden="1" w:unhideWhenUsed="1"/>
+    <w:lsdException w:name="heading 9" w:uiPriority="9" w:semiHidden="1" w:unhideWhenUsed="1" w:qFormat="1"/>
+    <w:lsdException w:name="toc 5" w:uiPriority="39" w:semiHidden="1" w:unhideWhenUsed="1"/>
+    <w:lsdException w:name="List Bullet 3" w:semiHidden="1" w:unhideWhenUsed="1"/>
+    <w:lsdException w:name="List Continue 4" w:semiHidden="1" w:unhideWhenUsed="1"/>
+    <w:lsdException w:name="toc 3" w:uiPriority="39" w:semiHidden="1" w:unhideWhenUsed="1"/>
+    <w:lsdException w:name="heading 6" w:uiPriority="9" w:semiHidden="1" w:unhideWhenUsed="1" w:qFormat="1"/>
+    <w:lsdException w:name="toc 9" w:uiPriority="39" w:semiHidden="1" w:unhideWhenUsed="1"/>
+    <w:lsdException w:name="annotation reference" w:semiHidden="1" w:unhideWhenUsed="1"/>
+    <w:lsdException w:name="Normal" w:uiPriority="0" w:qFormat="1"/>
     <w:lsdException w:name="annotation text" w:semiHidden="1" w:unhideWhenUsed="1"/>
-    <w:lsdException w:name="page number" w:semiHidden="1" w:unhideWhenUsed="1"/>
-    <w:lsdException w:name="Normal" w:uiPriority="0" w:qFormat="1"/>
-    <w:lsdException w:name="heading 7" w:uiPriority="9" w:semiHidden="1" w:unhideWhenUsed="1" w:qFormat="1"/>
-    <w:lsdException w:name="endnote text" w:semiHidden="1" w:unhideWhenUsed="1"/>
+    <w:lsdException w:name="index heading" w:semiHidden="1" w:unhideWhenUsed="1"/>
+    <w:lsdException w:name="List Continue 2" w:semiHidden="1" w:unhideWhenUsed="1"/>
+    <w:lsdException w:name="heading 4" w:uiPriority="9" w:semiHidden="1" w:unhideWhenUsed="1" w:qFormat="1"/>
+    <w:lsdException w:name="List Bullet 2" w:semiHidden="1" w:unhideWhenUsed="1"/>
+    <w:lsdException w:name="Hyperlink" w:semiHidden="1" w:unhideWhenUsed="1"/>
+    <w:lsdException w:name="Signature" w:semiHidden="1" w:unhideWhenUsed="1"/>
+    <w:lsdException w:name="List Continue 5" w:semiHidden="1" w:unhideWhenUsed="1"/>
+    <w:lsdException w:name="Title" w:uiPriority="10" w:qFormat="1"/>
+    <w:lsdException w:name="heading 1" w:uiPriority="9" w:qFormat="1"/>
     <w:lsdException w:name="toc 4" w:uiPriority="39" w:semiHidden="1" w:unhideWhenUsed="1"/>
-    <w:lsdException w:name="List Number" w:semiHidden="1" w:unhideWhenUsed="1"/>
-    <w:lsdException w:name="List Bullet 4" w:semiHidden="1" w:unhideWhenUsed="1"/>
+    <w:lsdException w:name="toa heading" w:semiHidden="1" w:unhideWhenUsed="1"/>
+    <w:lsdException w:name="index 3" w:semiHidden="1" w:unhideWhenUsed="1"/>
+    <w:lsdException w:name="caption" w:uiPriority="35" w:semiHidden="1" w:unhideWhenUsed="1" w:qFormat="1"/>
     <w:lsdException w:name="List Number 4" w:semiHidden="1" w:unhideWhenUsed="1"/>
-    <w:lsdException w:name="Hyperlink" w:semiHidden="1" w:unhideWhenUsed="1"/>
-    <w:lsdException w:name="macro" w:semiHidden="1" w:unhideWhenUsed="1"/>
-    <w:lsdException w:name="toc 9" w:uiPriority="39" w:semiHidden="1" w:unhideWhenUsed="1"/>
-    <w:lsdException w:name="index 1" w:semiHidden="1" w:unhideWhenUsed="1"/>
-    <w:lsdException w:name="Title" w:uiPriority="10" w:qFormat="1"/>
-    <w:lsdException w:name="Body Text Indent 3" w:semiHidden="1" w:unhideWhenUsed="1"/>
-    <w:lsdException w:name="footnote text" w:semiHidden="1" w:unhideWhenUsed="1"/>
-    <w:lsdException w:name="Note Heading" w:semiHidden="1" w:unhideWhenUsed="1"/>
-    <w:lsdException w:name="List Continue 3" w:semiHidden="1" w:unhideWhenUsed="1"/>
-    <w:lsdException w:name="List Continue 5" w:semiHidden="1" w:unhideWhenUsed="1"/>
+    <w:lsdException w:name="line number" w:semiHidden="1" w:unhideWhenUsed="1"/>
     <w:lsdException w:name="Body Text" w:semiHidden="1" w:unhideWhenUsed="1"/>
-    <w:lsdException w:name="toc 8" w:uiPriority="39" w:semiHidden="1" w:unhideWhenUsed="1"/>
-    <w:lsdException w:name="List Bullet" w:semiHidden="1" w:unhideWhenUsed="1"/>
-    <w:lsdException w:name="annotation reference" w:semiHidden="1" w:unhideWhenUsed="1"/>
+    <w:lsdException w:name="envelope address" w:semiHidden="1" w:unhideWhenUsed="1"/>
+    <w:lsdException w:name="Strong" w:uiPriority="22" w:qFormat="1"/>
     <w:lsdException w:name="Date" w:semiHidden="1" w:unhideWhenUsed="1"/>
-    <w:lsdException w:name="Salutation" w:semiHidden="1" w:unhideWhenUsed="1"/>
-    <w:lsdException w:name="heading 4" w:uiPriority="9" w:semiHidden="1" w:unhideWhenUsed="1" w:qFormat="1"/>
-    <w:lsdException w:name="envelope address" w:semiHidden="1" w:unhideWhenUsed="1"/>
-    <w:lsdException w:name="toc 3" w:uiPriority="39" w:semiHidden="1" w:unhideWhenUsed="1"/>
-    <w:lsdException w:name="index 7" w:semiHidden="1" w:unhideWhenUsed="1"/>
   </w:latentStyles>
-  <w:style w:type="paragraph" w:styleId="000006">
-    <w:name w:val="heading 1"/>
-    <w:basedOn w:val="Normal"/>
-    <w:next w:val="Normal"/>
-    <w:uiPriority w:val="9"/>
-    <w:qFormat w:val="1"/>
-    <w:pPr>
-      <w:keepNext w:val="1"/>
-      <w:keepLines w:val="1"/>
-      <w:spacing w:before="240" w:after="120"/>
-      <w:outlineLvl w:val="0"/>
-    </w:pPr>
-    <w:rPr>
-      <w:b w:val="1"/>
-      <w:sz w:val="32"/>
-      <w:szCs w:val="32"/>
-    </w:rPr>
-  </w:style>
   <w:style w:type="paragraph" w:styleId="000007">
     <w:name w:val="heading 2"/>
     <w:basedOn w:val="Normal"/>
@@ -18681,6 +20500,24 @@
       <w:rFonts w:ascii="SimSun" w:hAnsi="SimSun" w:eastAsia="SimSun" w:cs="SimSun"/>
       <w:sz w:val="24"/>
       <w:szCs w:val="24"/>
+    </w:rPr>
+  </w:style>
+  <w:style w:type="paragraph" w:styleId="000006">
+    <w:name w:val="heading 1"/>
+    <w:basedOn w:val="Normal"/>
+    <w:next w:val="Normal"/>
+    <w:uiPriority w:val="9"/>
+    <w:qFormat w:val="1"/>
+    <w:pPr>
+      <w:keepNext w:val="1"/>
+      <w:keepLines w:val="1"/>
+      <w:spacing w:before="240" w:after="120"/>
+      <w:outlineLvl w:val="0"/>
+    </w:pPr>
+    <w:rPr>
+      <w:b w:val="1"/>
+      <w:sz w:val="32"/>
+      <w:szCs w:val="32"/>
     </w:rPr>
   </w:style>
   <w:style w:type="paragraph" w:styleId="000005">

</xml_diff>